<commit_message>
Feat: Chat with LLM
</commit_message>
<xml_diff>
--- a/backend_mdb/app/documents/disease_lua.docx
+++ b/backend_mdb/app/documents/disease_lua.docx
@@ -18,10 +18,7 @@
         <w:t>Triệu chứng</w:t>
       </w:r>
       <w:r>
-        <w:t xml:space="preserve"> </w:t>
-      </w:r>
-      <w:r>
-        <w:t>Bệnh Đạo Ôn</w:t>
+        <w:t xml:space="preserve"> Bệnh Đạo Ôn</w:t>
       </w:r>
       <w:r>
         <w:t>:</w:t>
@@ -57,10 +54,7 @@
         <w:t>Điều kiện phát triển</w:t>
       </w:r>
       <w:r>
-        <w:t xml:space="preserve"> </w:t>
-      </w:r>
-      <w:r>
-        <w:t>Bệnh Đạo Ôn</w:t>
+        <w:t xml:space="preserve"> Bệnh Đạo Ôn</w:t>
       </w:r>
       <w:r>
         <w:t>:</w:t>
@@ -91,10 +85,7 @@
         <w:t>Biện pháp phòng trừ</w:t>
       </w:r>
       <w:r>
-        <w:t xml:space="preserve"> </w:t>
-      </w:r>
-      <w:r>
-        <w:t>Bệnh Đạo Ôn</w:t>
+        <w:t xml:space="preserve"> Bệnh Đạo Ôn</w:t>
       </w:r>
       <w:r>
         <w:t>:</w:t>
@@ -170,10 +161,7 @@
         <w:t>Triệu chứng</w:t>
       </w:r>
       <w:r>
-        <w:t xml:space="preserve"> </w:t>
-      </w:r>
-      <w:r>
-        <w:t>Bệnh Bạc Lá</w:t>
+        <w:t xml:space="preserve"> Bệnh Bạc Lá</w:t>
       </w:r>
       <w:r>
         <w:t>:</w:t>
@@ -209,10 +197,7 @@
         <w:t>Điều kiện phát triển</w:t>
       </w:r>
       <w:r>
-        <w:t xml:space="preserve"> </w:t>
-      </w:r>
-      <w:r>
-        <w:t>Bệnh Bạc Lá</w:t>
+        <w:t xml:space="preserve"> Bệnh Bạc Lá</w:t>
       </w:r>
       <w:r>
         <w:t>:</w:t>
@@ -242,10 +227,7 @@
         <w:t>Biện pháp phòng trừ</w:t>
       </w:r>
       <w:r>
-        <w:t xml:space="preserve"> </w:t>
-      </w:r>
-      <w:r>
-        <w:t>Bệnh Bạc Lá</w:t>
+        <w:t xml:space="preserve"> Bệnh Bạc Lá</w:t>
       </w:r>
       <w:r>
         <w:t>:</w:t>
@@ -322,10 +304,124 @@
         <w:t>Triệu chứng</w:t>
       </w:r>
       <w:r>
+        <w:t xml:space="preserve"> Bệnh Đốm Nâu</w:t>
+      </w:r>
+      <w:r>
+        <w:t>:</w:t>
+      </w:r>
+    </w:p>
+    <w:p/>
+    <w:p>
+      <w:r>
+        <w:t>Trên lá: Vết bệnh ban đầu là những chấm nhỏ màu nâu nhạt, sau đó lớn dần thành hình tròn hoặc bầu dục, có tâm màu xám và viền nâu đỏ. Nhiều vết bệnh liên kết lại có thể làm lá bị cháy khô.</w:t>
+      </w:r>
+    </w:p>
+    <w:p/>
+    <w:p>
+      <w:r>
+        <w:t>Trên hạt: Nấm tấn công làm hạt có các đốm nâu đen, gây ra hiện tượng lem lép hạt, hạt lúa có màu giống "trứng cút".</w:t>
+      </w:r>
+    </w:p>
+    <w:p/>
+    <w:p>
+      <w:r>
+        <w:t>Điều kiện phát triển</w:t>
+      </w:r>
+      <w:r>
+        <w:t xml:space="preserve"> Bệnh Đốm Nâu</w:t>
+      </w:r>
+      <w:r>
+        <w:t>:</w:t>
+      </w:r>
+    </w:p>
+    <w:p/>
+    <w:p>
+      <w:r>
+        <w:t>Bệnh phát triển mạnh trong điều kiện nhiệt độ cao nhưng ẩm độ thấp, hoặc trên các ruộng thiếu dinh dưỡng, đặc biệt là thiếu kali.</w:t>
+      </w:r>
+    </w:p>
+    <w:p/>
+    <w:p>
+      <w:r>
+        <w:t>Ruộng bị ngộ độc phèn, ngộ độc hữu cơ cũng dễ bị bệnh tấn công.</w:t>
+      </w:r>
+    </w:p>
+    <w:p/>
+    <w:p>
+      <w:r>
+        <w:t>Biện pháp phòng trừ</w:t>
+      </w:r>
+      <w:r>
+        <w:t xml:space="preserve"> Bệnh Đốm Nâu</w:t>
+      </w:r>
+      <w:r>
+        <w:t>:</w:t>
+      </w:r>
+    </w:p>
+    <w:p/>
+    <w:p>
+      <w:r>
+        <w:t>Cải tạo đất, bón vôi và phân lân để giảm độ phèn và ngộ độc hữu cơ.</w:t>
+      </w:r>
+    </w:p>
+    <w:p/>
+    <w:p>
+      <w:r>
+        <w:t>Bón phân cân đối, cung cấp đủ kali.</w:t>
+      </w:r>
+    </w:p>
+    <w:p/>
+    <w:p>
+      <w:r>
+        <w:t>Sử dụng các loại thuốc có hoạt chất đặc trị để phun khi bệnh chớm xuất hiện.</w:t>
+      </w:r>
+    </w:p>
+    <w:p>
+      <w:r>
+        <w:t>Nguồn tài liệu Bệnh Đốm Nâu:</w:t>
+      </w:r>
+    </w:p>
+    <w:p>
+      <w:r>
+        <w:t>"Bài 77: BỆNH ĐỐM NÂU" - Ngân hàng Kiến thức Trồng lúa - Viện Khoa học Nông nghiệp Việt Nam (VAAS)</w:t>
+      </w:r>
+    </w:p>
+    <w:p/>
+    <w:p>
+      <w:r>
+        <w:t>"Bệnh đốm nâu trên lúa: Tổng quan và các biện pháp quản lý" - Sinh Học Châu Á</w:t>
+      </w:r>
+    </w:p>
+    <w:p/>
+    <w:p>
+      <w:r>
+        <w:t>"Bệnh Đốm Nâu Trên Lúa: Nguyên Nhân, Cách Phòng Trừ" - Công ty Cổ phần TÂY ĐÔ</w:t>
+      </w:r>
+    </w:p>
+    <w:p/>
+    <w:p>
+      <w:r>
+        <w:t xml:space="preserve">## 4. Bệnh Gạch Nâu (Cercospora oryzae) </w:t>
+      </w:r>
+      <w:r>
+        <w:rPr>
+          <w:rFonts w:ascii="Segoe UI Emoji" w:hAnsi="Segoe UI Emoji" w:cs="Segoe UI Emoji"/>
+        </w:rPr>
         <w:t xml:space="preserve"> </w:t>
       </w:r>
-      <w:r>
-        <w:t>Bệnh Đốm Nâu</w:t>
+    </w:p>
+    <w:p>
+      <w:r>
+        <w:t>Bệnh này còn được gọi là bệnh đốm sọc nâu, do nấm Cercospora oryzae gây ra.</w:t>
+      </w:r>
+    </w:p>
+    <w:p/>
+    <w:p>
+      <w:r>
+        <w:t>Triệu chứng</w:t>
+      </w:r>
+      <w:r>
+        <w:t xml:space="preserve"> Bệnh Gạch Nâu</w:t>
       </w:r>
       <w:r>
         <w:t>:</w:t>
@@ -334,13 +430,13 @@
     <w:p/>
     <w:p>
       <w:r>
-        <w:t>Trên lá: Vết bệnh ban đầu là những chấm nhỏ màu nâu nhạt, sau đó lớn dần thành hình tròn hoặc bầu dục, có tâm màu xám và viền nâu đỏ. Nhiều vết bệnh liên kết lại có thể làm lá bị cháy khô.</w:t>
-      </w:r>
-    </w:p>
-    <w:p/>
-    <w:p>
-      <w:r>
-        <w:t>Trên hạt: Nấm tấn công làm hạt có các đốm nâu đen, gây ra hiện tượng lem lép hạt, hạt lúa có màu giống "trứng cút".</w:t>
+        <w:t>Vết bệnh chủ yếu xuất hiện trên phiến lá, là những sọc ngắn, hẹp như một nét gạch, chạy dọc theo gân lá.</w:t>
+      </w:r>
+    </w:p>
+    <w:p/>
+    <w:p>
+      <w:r>
+        <w:t>Vết bệnh có chiều dài 2-10 mm, rộng 1-1,5 mm, màu nâu nhạt hoặc nâu sẫm tùy giống.</w:t>
       </w:r>
     </w:p>
     <w:p/>
@@ -349,10 +445,7 @@
         <w:t>Điều kiện phát triển</w:t>
       </w:r>
       <w:r>
-        <w:t xml:space="preserve"> </w:t>
-      </w:r>
-      <w:r>
-        <w:t>Bệnh Đốm Nâu</w:t>
+        <w:t xml:space="preserve"> Bệnh Gạch Nâu</w:t>
       </w:r>
       <w:r>
         <w:t>:</w:t>
@@ -361,13 +454,13 @@
     <w:p/>
     <w:p>
       <w:r>
-        <w:t>Bệnh phát triển mạnh trong điều kiện nhiệt độ cao nhưng ẩm độ thấp, hoặc trên các ruộng thiếu dinh dưỡng, đặc biệt là thiếu kali.</w:t>
-      </w:r>
-    </w:p>
-    <w:p/>
-    <w:p>
-      <w:r>
-        <w:t>Ruộng bị ngộ độc phèn, ngộ độc hữu cơ cũng dễ bị bệnh tấn công.</w:t>
+        <w:t>Bệnh thường phát triển muộn, vào giai đoạn lúa trỗ và chín sữa.</w:t>
+      </w:r>
+    </w:p>
+    <w:p/>
+    <w:p>
+      <w:r>
+        <w:t>Phát triển mạnh trên các chân ruộng thiếu kali và trong điều kiện nhiệt độ từ 25-28°C.</w:t>
       </w:r>
     </w:p>
     <w:p/>
@@ -376,10 +469,7 @@
         <w:t>Biện pháp phòng trừ</w:t>
       </w:r>
       <w:r>
-        <w:t xml:space="preserve"> </w:t>
-      </w:r>
-      <w:r>
-        <w:t>Bệnh Đốm Nâu</w:t>
+        <w:t xml:space="preserve"> Bệnh Gạch Nâu</w:t>
       </w:r>
       <w:r>
         <w:t>:</w:t>
@@ -388,70 +478,84 @@
     <w:p/>
     <w:p>
       <w:r>
-        <w:t>Cải tạo đất, bón vôi và phân lân để giảm độ phèn và ngộ độc hữu cơ.</w:t>
-      </w:r>
-    </w:p>
-    <w:p/>
-    <w:p>
-      <w:r>
-        <w:t>Bón phân cân đối, cung cấp đủ kali.</w:t>
-      </w:r>
-    </w:p>
-    <w:p/>
-    <w:p>
-      <w:r>
-        <w:t>Sử dụng các loại thuốc có hoạt chất đặc trị để phun khi bệnh chớm xuất hiện.</w:t>
-      </w:r>
-    </w:p>
-    <w:p>
-      <w:r>
-        <w:t>Nguồn tài liệu Bệnh Đốm Nâu:</w:t>
-      </w:r>
-    </w:p>
-    <w:p>
-      <w:r>
-        <w:t>"Bài 77: BỆNH ĐỐM NÂU" - Ngân hàng Kiến thức Trồng lúa - Viện Khoa học Nông nghiệp Việt Nam (VAAS)</w:t>
-      </w:r>
-    </w:p>
-    <w:p/>
-    <w:p>
-      <w:r>
-        <w:t>"Bệnh đốm nâu trên lúa: Tổng quan và các biện pháp quản lý" - Sinh Học Châu Á</w:t>
-      </w:r>
-    </w:p>
-    <w:p/>
-    <w:p>
-      <w:r>
-        <w:t>"Bệnh Đốm Nâu Trên Lúa: Nguyên Nhân, Cách Phòng Trừ" - Công ty Cổ phần TÂY ĐÔ</w:t>
-      </w:r>
-    </w:p>
-    <w:p/>
-    <w:p>
-      <w:r>
-        <w:t xml:space="preserve">## 4. Bệnh Gạch Nâu (Cercospora oryzae) </w:t>
-      </w:r>
-      <w:r>
-        <w:rPr>
-          <w:rFonts w:ascii="Segoe UI Emoji" w:hAnsi="Segoe UI Emoji" w:cs="Segoe UI Emoji"/>
-        </w:rPr>
-        <w:t xml:space="preserve"> </w:t>
-      </w:r>
-    </w:p>
-    <w:p>
-      <w:r>
-        <w:t>Bệnh này còn được gọi là bệnh đốm sọc nâu, do nấm Cercospora oryzae gây ra.</w:t>
-      </w:r>
-    </w:p>
-    <w:p/>
-    <w:p>
-      <w:r>
-        <w:t>Triệu chứng</w:t>
-      </w:r>
-      <w:r>
-        <w:t xml:space="preserve"> </w:t>
-      </w:r>
-      <w:r>
-        <w:t>Bệnh Gạch Nâu</w:t>
+        <w:t>Bón đủ kali cho lúa.</w:t>
+      </w:r>
+    </w:p>
+    <w:p/>
+    <w:p>
+      <w:r>
+        <w:t>Vệ sinh đồng ruộng, dọn sạch tàn dư cây trồng từ vụ trước.</w:t>
+      </w:r>
+    </w:p>
+    <w:p/>
+    <w:p>
+      <w:r>
+        <w:t>Sử dụng các giống kháng bệnh. Khi cần thiết có thể phun các loại thuốc diệt nấm phổ rộng.</w:t>
+      </w:r>
+    </w:p>
+    <w:p>
+      <w:r>
+        <w:t>Nguồn tài liệu Bệnh Gạch Nâu Lúa:</w:t>
+      </w:r>
+    </w:p>
+    <w:p>
+      <w:r>
+        <w:t>"Bệnh gạch nâu ở Lúa" - Plantix</w:t>
+      </w:r>
+    </w:p>
+    <w:p/>
+    <w:p>
+      <w:r>
+        <w:t>"Cách Phòng Và Trị Bệnh Gạch Nâu Gây Hại Trên Cây Lúa" - Thế Giới Nông Nghiệp</w:t>
+      </w:r>
+    </w:p>
+    <w:p/>
+    <w:p>
+      <w:r>
+        <w:t>"Bệnh gạch nâu: Đặc điểm và các biện pháp quản lý" - Sinh Học Châu Á</w:t>
+      </w:r>
+    </w:p>
+    <w:p/>
+    <w:p>
+      <w:r>
+        <w:t>## Sâu Hại</w:t>
+      </w:r>
+    </w:p>
+    <w:p>
+      <w:r>
+        <w:t>1. Sâu bọ gai (Dicladispa armigera)</w:t>
+      </w:r>
+    </w:p>
+    <w:p>
+      <w:r>
+        <w:t>Triệu chứng &amp; Tác hại</w:t>
+      </w:r>
+      <w:r>
+        <w:t xml:space="preserve"> Sâu bọ gai</w:t>
+      </w:r>
+      <w:r>
+        <w:t>: Sâu non đục vào bên trong lá, ăn phần diệp lục giữa hai lớp biểu bì, tạo thành các đường hầm màu trắng. Con trưởng thành có nhiều gai, màu đen bóng, ăn mặt trên của phiến lá, để lại lớp biểu bì bên dưới. Sâu non và trưởng thành hoạt động mạnh vào buổi sáng.</w:t>
+      </w:r>
+    </w:p>
+    <w:p/>
+    <w:p>
+      <w:r>
+        <w:t>Phòng trừ</w:t>
+      </w:r>
+      <w:r>
+        <w:t xml:space="preserve"> Sâu bọ gai</w:t>
+      </w:r>
+      <w:r>
+        <w:t>: Vệ sinh đồng ruộng, diệt cỏ dại. Khi mật độ trứng cao, có thể ngắt bỏ ngọn lá có trứng. Phun thuốc khi sâu phát sinh rộ.</w:t>
+      </w:r>
+    </w:p>
+    <w:p/>
+    <w:p>
+      <w:r>
+        <w:t>Nguồn tài liệu</w:t>
+      </w:r>
+      <w:r>
+        <w:t xml:space="preserve"> Sâu bọ gai</w:t>
       </w:r>
       <w:r>
         <w:t>:</w:t>
@@ -460,106 +564,19 @@
     <w:p/>
     <w:p>
       <w:r>
-        <w:t>Vết bệnh chủ yếu xuất hiện trên phiến lá, là những sọc ngắn, hẹp như một nét gạch, chạy dọc theo gân lá.</w:t>
-      </w:r>
-    </w:p>
-    <w:p/>
-    <w:p>
-      <w:r>
-        <w:t>Vết bệnh có chiều dài 2-10 mm, rộng 1-1,5 mm, màu nâu nhạt hoặc nâu sẫm tùy giống.</w:t>
-      </w:r>
-    </w:p>
-    <w:p/>
-    <w:p>
-      <w:r>
-        <w:t>Điều kiện phát triển</w:t>
-      </w:r>
-      <w:r>
-        <w:t xml:space="preserve"> </w:t>
-      </w:r>
-      <w:r>
-        <w:t>Bệnh Gạch Nâu</w:t>
-      </w:r>
-      <w:r>
-        <w:t>:</w:t>
-      </w:r>
-    </w:p>
-    <w:p/>
-    <w:p>
-      <w:r>
-        <w:t>Bệnh thường phát triển muộn, vào giai đoạn lúa trỗ và chín sữa.</w:t>
-      </w:r>
-    </w:p>
-    <w:p/>
-    <w:p>
-      <w:r>
-        <w:t>Phát triển mạnh trên các chân ruộng thiếu kali và trong điều kiện nhiệt độ từ 25-28°C.</w:t>
-      </w:r>
-    </w:p>
-    <w:p/>
-    <w:p>
-      <w:r>
-        <w:t>Biện pháp phòng trừ</w:t>
-      </w:r>
-      <w:r>
-        <w:t xml:space="preserve"> </w:t>
-      </w:r>
-      <w:r>
-        <w:t>Bệnh Gạch Nâu</w:t>
-      </w:r>
-      <w:r>
-        <w:t>:</w:t>
-      </w:r>
-    </w:p>
-    <w:p/>
-    <w:p>
-      <w:r>
-        <w:t>Bón đủ kali cho lúa.</w:t>
-      </w:r>
-    </w:p>
-    <w:p/>
-    <w:p>
-      <w:r>
-        <w:t>Vệ sinh đồng ruộng, dọn sạch tàn dư cây trồng từ vụ trước.</w:t>
-      </w:r>
-    </w:p>
-    <w:p/>
-    <w:p>
-      <w:r>
-        <w:t>Sử dụng các giống kháng bệnh. Khi cần thiết có thể phun các loại thuốc diệt nấm phổ rộng.</w:t>
-      </w:r>
-    </w:p>
-    <w:p>
-      <w:r>
-        <w:t>Nguồn tài liệu Bệnh Gạch Nâu Lúa:</w:t>
-      </w:r>
-    </w:p>
-    <w:p>
-      <w:r>
-        <w:t>"Bệnh gạch nâu ở Lúa" - Plantix</w:t>
-      </w:r>
-    </w:p>
-    <w:p/>
-    <w:p>
-      <w:r>
-        <w:t>"Cách Phòng Và Trị Bệnh Gạch Nâu Gây Hại Trên Cây Lúa" - Thế Giới Nông Nghiệp</w:t>
-      </w:r>
-    </w:p>
-    <w:p/>
-    <w:p>
-      <w:r>
-        <w:t>"Bệnh gạch nâu: Đặc điểm và các biện pháp quản lý" - Sinh Học Châu Á</w:t>
-      </w:r>
-    </w:p>
-    <w:p/>
-    <w:p>
-      <w:r>
-        <w:t>## Sâu Hại</w:t>
-      </w:r>
-    </w:p>
-    <w:p>
-      <w:r>
-        <w:t>1. Sâu bọ gai (Dicladispa armigera)</w:t>
+        <w:t>Bài 58: SÂU GAI - Ngân hàng Kiến thức Trồng lúa (thuộc Viện Khoa học Nông nghiệp Việt Nam - VAAS).</w:t>
+      </w:r>
+    </w:p>
+    <w:p/>
+    <w:p>
+      <w:r>
+        <w:t>Sâu gai hại lúa là gì? Tác hại và cách phòng trừ sâu bệnh cho cây lúa - VNFarm.</w:t>
+      </w:r>
+    </w:p>
+    <w:p/>
+    <w:p>
+      <w:r>
+        <w:t>2. Sâu phao (Nymphula depunctalis)</w:t>
       </w:r>
     </w:p>
     <w:p>
@@ -567,13 +584,10 @@
         <w:t>Triệu chứng &amp; Tác hại</w:t>
       </w:r>
       <w:r>
-        <w:t xml:space="preserve"> </w:t>
-      </w:r>
-      <w:r>
-        <w:t>Sâu bọ gai</w:t>
-      </w:r>
-      <w:r>
-        <w:t>: Sâu non đục vào bên trong lá, ăn phần diệp lục giữa hai lớp biểu bì, tạo thành các đường hầm màu trắng. Con trưởng thành có nhiều gai, màu đen bóng, ăn mặt trên của phiến lá, để lại lớp biểu bì bên dưới. Sâu non và trưởng thành hoạt động mạnh vào buổi sáng.</w:t>
+        <w:t xml:space="preserve"> Sâu phao</w:t>
+      </w:r>
+      <w:r>
+        <w:t>: Sâu non cắt lá lúa thành từng đoạn, cuộn lại thành ống để làm "phao" trú ngụ và di chuyển trên mặt nước. Sâu non tuổi nhỏ ăn phần biểu bì lá, còn sâu tuổi lớn có thể cắn đứt ngang lá và dảnh mạ. Sâu thường gây hại mạnh vào ban đêm hoặc những ngày trời râm mát, mưa nhiều, ở giai đoạn mạ và lúa đẻ nhánh.</w:t>
       </w:r>
     </w:p>
     <w:p/>
@@ -582,69 +596,7 @@
         <w:t>Phòng trừ</w:t>
       </w:r>
       <w:r>
-        <w:t xml:space="preserve"> </w:t>
-      </w:r>
-      <w:r>
-        <w:t>Sâu bọ gai</w:t>
-      </w:r>
-      <w:r>
-        <w:t>: Vệ sinh đồng ruộng, diệt cỏ dại. Khi mật độ trứng cao, có thể ngắt bỏ ngọn lá có trứng. Phun thuốc khi sâu phát sinh rộ.</w:t>
-      </w:r>
-    </w:p>
-    <w:p/>
-    <w:p>
-      <w:r>
-        <w:t>Nguồn tài liệu</w:t>
-      </w:r>
-      <w:r>
-        <w:t xml:space="preserve"> Sâu bọ gai</w:t>
-      </w:r>
-      <w:r>
-        <w:t>:</w:t>
-      </w:r>
-    </w:p>
-    <w:p/>
-    <w:p>
-      <w:r>
-        <w:t>Bài 58: SÂU GAI - Ngân hàng Kiến thức Trồng lúa (thuộc Viện Khoa học Nông nghiệp Việt Nam - VAAS).</w:t>
-      </w:r>
-    </w:p>
-    <w:p/>
-    <w:p>
-      <w:r>
-        <w:t>Sâu gai hại lúa là gì? Tác hại và cách phòng trừ sâu bệnh cho cây lúa - VNFarm.</w:t>
-      </w:r>
-    </w:p>
-    <w:p/>
-    <w:p>
-      <w:r>
-        <w:t>2. Sâu phao (Nymphula depunctalis)</w:t>
-      </w:r>
-    </w:p>
-    <w:p>
-      <w:r>
-        <w:t>Triệu chứng &amp; Tác hại</w:t>
-      </w:r>
-      <w:r>
-        <w:t xml:space="preserve"> </w:t>
-      </w:r>
-      <w:r>
-        <w:t>Sâu phao</w:t>
-      </w:r>
-      <w:r>
-        <w:t>: Sâu non cắt lá lúa thành từng đoạn, cuộn lại thành ống để làm "phao" trú ngụ và di chuyển trên mặt nước. Sâu non tuổi nhỏ ăn phần biểu bì lá, còn sâu tuổi lớn có thể cắn đứt ngang lá và dảnh mạ. Sâu thường gây hại mạnh vào ban đêm hoặc những ngày trời râm mát, mưa nhiều, ở giai đoạn mạ và lúa đẻ nhánh.</w:t>
-      </w:r>
-    </w:p>
-    <w:p/>
-    <w:p>
-      <w:r>
-        <w:t>Phòng trừ</w:t>
-      </w:r>
-      <w:r>
-        <w:t xml:space="preserve"> </w:t>
-      </w:r>
-      <w:r>
-        <w:t>Sâu phao</w:t>
+        <w:t xml:space="preserve"> Sâu phao</w:t>
       </w:r>
       <w:r>
         <w:t>: Có thể tháo nước trong ruộng ra nhiều ngày để diệt sâu, nhưng cần lưu ý việc này có thể làm cỏ dại mọc nhiều. Khi mật độ sâu cao, cần sử dụng các loại thuốc bảo vệ thực vật đặc trị.</w:t>
@@ -691,10 +643,7 @@
         <w:t>Triệu chứng</w:t>
       </w:r>
       <w:r>
-        <w:t xml:space="preserve"> </w:t>
-      </w:r>
-      <w:r>
-        <w:t>Bệnh Khô Vằn - Đốm Vằn</w:t>
+        <w:t xml:space="preserve"> Bệnh Khô Vằn - Đốm Vằn</w:t>
       </w:r>
       <w:r>
         <w:t>: Bệnh thường phát sinh ở bẹ lá sát mặt nước, ban đầu là vết đốm hình bầu dục, sau lan rộng thành các mảng có hình vằn da hổ hoặc dạng đám mây. Bệnh nặng có thể lan lên lá, cổ bông và hạt, làm cây chết lụi, bông lúa bị nghẹn, hạt lép, lửng. Trên vết bệnh thường xuất hiện các hạch nấm màu nâu, dễ dàng rơi xuống nước để lây lan.</w:t>
@@ -706,10 +655,7 @@
         <w:t>Phòng trừ</w:t>
       </w:r>
       <w:r>
-        <w:t xml:space="preserve"> </w:t>
-      </w:r>
-      <w:r>
-        <w:t>Bệnh Khô Vằn - Đốm Vằn</w:t>
+        <w:t xml:space="preserve"> Bệnh Khô Vằn - Đốm Vằn</w:t>
       </w:r>
       <w:r>
         <w:t>: Dọn sạch tàn dư cây trồng, làm cỏ. Bón phân cân đối, tránh thừa đạm. Giữ mực nước ruộng hợp lý. Sử dụng thuốc hóa học khi bệnh chớm xuất hiện.</w:t>
@@ -756,10 +702,7 @@
         <w:t>Triệu chứng</w:t>
       </w:r>
       <w:r>
-        <w:t xml:space="preserve"> </w:t>
-      </w:r>
-      <w:r>
-        <w:t>Bệnh Nghẹt Rễ - Thối Đen Rễ</w:t>
+        <w:t xml:space="preserve"> Bệnh Nghẹt Rễ - Thối Đen Rễ</w:t>
       </w:r>
       <w:r>
         <w:t>: Bệnh không do vi sinh vật gây ra mà do ngộ độc hữu cơ và các khí độc (như H₂S) sinh ra trong điều kiện yếm khí. Rễ lúa bị thối đen, không ra rễ mới, lá vàng từ chóp rồi khô dần. Cây còi cọc, đẻ nhánh kém, có thể chết thành từng chòm.</w:t>
@@ -771,10 +714,7 @@
         <w:t>Phòng trừ</w:t>
       </w:r>
       <w:r>
-        <w:t xml:space="preserve"> </w:t>
-      </w:r>
-      <w:r>
-        <w:t>Bệnh Nghẹt Rễ - Thối Đen Rễ</w:t>
+        <w:t xml:space="preserve"> Bệnh Nghẹt Rễ - Thối Đen Rễ</w:t>
       </w:r>
       <w:r>
         <w:t>: Cày ải phơi đất kỹ. Bón vôi và phân hữu cơ hoai mục. Khi ruộng bị bệnh, cần tháo cạn nước, phơi ruộng 2-3 ngày cho đất nứt chân chim rồi cho nước mới vào.</w:t>
@@ -816,10 +756,7 @@
         <w:t>Triệu chứng</w:t>
       </w:r>
       <w:r>
-        <w:t xml:space="preserve"> </w:t>
-      </w:r>
-      <w:r>
-        <w:t>Bệnh Lem Lép Hạt</w:t>
+        <w:t xml:space="preserve"> Bệnh Lem Lép Hạt</w:t>
       </w:r>
       <w:r>
         <w:t>: Đây là tên gọi chung cho hiện tượng vỏ trấu có màu nâu, đen, lốm đốm, hạt lúa có thể bị lép (không có gạo) hoặc lửng (ít gạo). Bệnh do nhiều loại nấm và vi khuẩn gây ra, làm giảm năng suất và chất lượng gạo.</w:t>
@@ -831,10 +768,7 @@
         <w:t>Phòng trừ</w:t>
       </w:r>
       <w:r>
-        <w:t xml:space="preserve"> </w:t>
-      </w:r>
-      <w:r>
-        <w:t>Bệnh Lem Lép Hạt</w:t>
+        <w:t xml:space="preserve"> Bệnh Lem Lép Hạt</w:t>
       </w:r>
       <w:r>
         <w:t>: Bón phân cân đối, đặc biệt là bón đủ kali. Phòng trừ tốt sâu bệnh ở giai đoạn đòng-trổ. Phun thuốc phòng bệnh 2 lần vào thời điểm lúa bắt đầu trổ và trổ đều.</w:t>
@@ -880,10 +814,7 @@
         <w:t>Tác nhân</w:t>
       </w:r>
       <w:r>
-        <w:t xml:space="preserve"> </w:t>
-      </w:r>
-      <w:r>
-        <w:t>Bệnh Tungro</w:t>
+        <w:t xml:space="preserve"> Bệnh Tungro</w:t>
       </w:r>
       <w:r>
         <w:t>: Do sự kết hợp của 2 loại virus (RTBV và RTSV), lây truyền qua rầy xanh đuôi đen.</w:t>
@@ -895,10 +826,7 @@
         <w:t>Triệu chứng</w:t>
       </w:r>
       <w:r>
-        <w:t xml:space="preserve"> </w:t>
-      </w:r>
-      <w:r>
-        <w:t>Bệnh Tungro</w:t>
+        <w:t xml:space="preserve"> Bệnh Tungro</w:t>
       </w:r>
       <w:r>
         <w:t>: Cây bị lùn, đẻ nhánh kém. Lá chuyển màu từ vàng đến vàng cam, bắt đầu từ chóp lá lan xuống. Bông lúa nhỏ, trổ không thoát và hạt bị lép.</w:t>
@@ -940,10 +868,7 @@
         <w:t>Tác nhân</w:t>
       </w:r>
       <w:r>
-        <w:t xml:space="preserve"> </w:t>
-      </w:r>
-      <w:r>
-        <w:t>Bệnh Vàng Lùn (RGSV) và Lùn Xoắn Lá (RRSV)</w:t>
+        <w:t xml:space="preserve"> Bệnh Vàng Lùn (RGSV) và Lùn Xoắn Lá (RRSV)</w:t>
       </w:r>
       <w:r>
         <w:t>: Hai bệnh này do 2 loại virus khác nhau gây ra nhưng đều do rầy nâu truyền bệnh và thường được nhắc đến cùng nhau.</w:t>
@@ -955,10 +880,7 @@
         <w:t>Triệu chứng</w:t>
       </w:r>
       <w:r>
-        <w:t xml:space="preserve"> </w:t>
-      </w:r>
-      <w:r>
-        <w:t>Bệnh Vàng Lùn (RGSV) và Lùn Xoắn Lá (RRSV)</w:t>
+        <w:t xml:space="preserve"> Bệnh Vàng Lùn (RGSV) và Lùn Xoắn Lá (RRSV)</w:t>
       </w:r>
       <w:r>
         <w:t>:</w:t>
@@ -1018,102 +940,2260 @@
         <w:t>Tác nhân</w:t>
       </w:r>
       <w:r>
+        <w:t xml:space="preserve"> Bệnh Lùn Sọc Đen (LSĐ)</w:t>
+      </w:r>
+      <w:r>
+        <w:t>: Do virus lùn sọc đen phương Nam gây ra, môi giới truyền bệnh là rầy nâu.</w:t>
+      </w:r>
+    </w:p>
+    <w:p/>
+    <w:p>
+      <w:r>
+        <w:t>Triệu chứng</w:t>
+      </w:r>
+      <w:r>
+        <w:t xml:space="preserve"> Bệnh Lùn Sọc Đen (LSĐ)</w:t>
+      </w:r>
+      <w:r>
+        <w:t>: Cây thấp lùn, lá xanh đậm, có thể xoăn ở đầu lá. Đặc trưng là xuất hiện các u sáp và sọc đen trên bẹ và lóng thân. Cây bị bệnh nặng không trổ bông được hoặc hạt bị đen.</w:t>
+      </w:r>
+    </w:p>
+    <w:p/>
+    <w:p>
+      <w:r>
+        <w:t>Nguồn tài liệu</w:t>
+      </w:r>
+      <w:r>
+        <w:t xml:space="preserve"> Bệnh Lùn Sọc Đen (LSĐ)</w:t>
+      </w:r>
+      <w:r>
+        <w:t>:</w:t>
+      </w:r>
+    </w:p>
+    <w:p/>
+    <w:p>
+      <w:r>
+        <w:t>Biện pháp phòng trừ bệnh lùn sọc đen hại ngô, lúa vụ Đông Xuân - Trung tâm Khuyến nông Quốc gia.</w:t>
+      </w:r>
+    </w:p>
+    <w:p/>
+    <w:p>
+      <w:r>
+        <w:t>Biện pháp phòng, trừ bệnh lùn sọc đen hại lúa - Báo điện tử Chính phủ.</w:t>
+      </w:r>
+    </w:p>
+    <w:p/>
+    <w:p>
+      <w:r>
+        <w:t xml:space="preserve">Biện pháp quản lý cho các nhóm bệnh về virus </w:t>
+      </w:r>
+      <w:r>
+        <w:t>như Tungro, vàng lùn và lùn lá xoắn, lùn sọc đen</w:t>
+      </w:r>
+      <w:r>
+        <w:t xml:space="preserve"> (bệnh do virus gây ra không có thuốc đặc trị</w:t>
+      </w:r>
+      <w:r>
         <w:t xml:space="preserve"> </w:t>
       </w:r>
       <w:r>
-        <w:t>Bệnh Lùn Sọc Đen (LSĐ)</w:t>
-      </w:r>
-      <w:r>
-        <w:t>: Do virus lùn sọc đen phương Nam gây ra, môi giới truyền bệnh là rầy nâu.</w:t>
-      </w:r>
-    </w:p>
-    <w:p/>
-    <w:p>
-      <w:r>
-        <w:t>Triệu chứng</w:t>
-      </w:r>
-      <w:r>
+        <w:t>do đó biện pháp phòng trừ chính là quản lý môi giới truyền bệnh</w:t>
+      </w:r>
+      <w:r>
+        <w:t>):</w:t>
+      </w:r>
+    </w:p>
+    <w:p>
+      <w:r>
+        <w:t>Thăm đồng thường xuyên để phát hiện sớm rầy.</w:t>
+      </w:r>
+    </w:p>
+    <w:p/>
+    <w:p>
+      <w:r>
+        <w:t>Sử dụng giống kháng rầy.</w:t>
+      </w:r>
+    </w:p>
+    <w:p/>
+    <w:p>
+      <w:r>
+        <w:t>Bảo vệ thiên địch của rầy.</w:t>
+      </w:r>
+    </w:p>
+    <w:p/>
+    <w:p>
+      <w:r>
+        <w:t>Nhổ bỏ và tiêu hủy sớm những cây bị bệnh để tránh lây lan.</w:t>
+      </w:r>
+    </w:p>
+    <w:p/>
+    <w:p>
+      <w:r>
+        <w:t>Sử dụng thuốc trừ rầy khi mật độ cao theo nguyên tắc "4 đúng".</w:t>
+      </w:r>
+    </w:p>
+    <w:p/>
+    <w:p/>
+    <w:p/>
+    <w:p>
+      <w:r>
+        <w:lastRenderedPageBreak/>
+        <w:t xml:space="preserve">### </w:t>
+      </w:r>
+      <w:r>
+        <w:t>Hướng dẫn phòng trừ sâu cuốn lá nhỏ hại lúa</w:t>
+      </w:r>
+    </w:p>
+    <w:p>
+      <w:r>
+        <w:t>            Sâu cuốn lá nhỏ hại lúa có tên khoa học là Cnaphalocrocis medinalin. Thuộc họ Ngài Sáng (Pyralidae), bộ Cánh Vảy (Lepidoptera).</w:t>
+      </w:r>
+    </w:p>
+    <w:p>
+      <w:r>
+        <w:rPr>
+          <w:b/>
+          <w:bCs/>
+        </w:rPr>
+        <w:t>             </w:t>
+      </w:r>
+      <w:r>
+        <w:t>1. Triệu chứng gây hại</w:t>
+      </w:r>
+      <w:r>
+        <w:t xml:space="preserve"> của sâu cuốn lá nhỏ</w:t>
+      </w:r>
+    </w:p>
+    <w:p>
+      <w:r>
+        <w:t>             Sâu cuốn lá ăn biểu bì mặt trên và diệp lục của lá dọc theo gân lá tạo thành những vệt trắng dài, các vệt này có thể nối liền với nhau thành từng mảng làm giảm diện tích quang hợp, đặc biệt là trên lá đòng hoặc lá công năng sẽ làm giảm năng suất rõ rệt.</w:t>
+      </w:r>
+    </w:p>
+    <w:p>
+      <w:r>
+        <w:t>             2. Đặc điểm hình thái</w:t>
+      </w:r>
+      <w:r>
+        <w:t xml:space="preserve"> của sâu cuốn lá nhỏ</w:t>
+      </w:r>
+    </w:p>
+    <w:p>
+      <w:r>
+        <w:t>             Vòng đời của sâu cuốn lá nhỏ hại lúa trung bình khoảng 28 - 36 ngày, gồm 4 giai đoạn:</w:t>
+      </w:r>
+    </w:p>
+    <w:p>
+      <w:r>
+        <w:t>          - Trưởng thành (bướm, ngài): Chiều dài thân 8 - 12mm, sải cánh rộng 19 – 23mm, nền cánh màu vàng rơm, bìa cánh có 1 đường viền màu nâu đậm, giữa cánh có 3 sọc màu nâu, 2 sọc bìa dài và sọc giữa ngắn; khi đậu, trưởng thành xếp cánh thành hình tam giác và khi có tác động chúng bay rất nhanh. Một trưởng thành cái có thể đẻ đến 300 trứng; trứng được đẻ rải rác hay thành từng nhóm dọc gân chính của lá, mỗi nhóm từ 10 - 12 trứng ở cả hai mặt lá, nhưng mặt trên có nhiều trứng hơn. Trưởng thành có thời gian 2 - 6 ngày vũ hóa và đẻ trứng.</w:t>
+      </w:r>
+    </w:p>
+    <w:p>
+      <w:r>
+        <w:t>          - Trứng: Hình bầu dục dài khoảng 0,5 mm, màu trắng, chuyển sang màu vàng nhạt khi sắp nở. Trứng có thời gian 6 - 7 ngày để nở.</w:t>
+      </w:r>
+    </w:p>
+    <w:p>
+      <w:r>
+        <w:t>           - Sâu non: Mới nở màu trắng sữa, có lông nâu phủ khắp mình, đầu màu nâu đen; sâu lớn đẫy sức dài khoảng 19 – 22 mm, màu xanh lá mạ, thân chia đốt rất rõ ràng. Sâu non có 5 tuổi, gây hại mạnh nhất ở tuổi 2-3. Một con sâu cuốn lá nhỏ thường gây hại 3 - 5 lá trong một vòng đời và hóa nhộng ngay trong bao lá. Sâu non chiếm khoảng thời gian 14 - 21 ngày.</w:t>
+      </w:r>
+    </w:p>
+    <w:p>
+      <w:r>
+        <w:t>           - Nhộng: Dài 7 - 10mm màu vàng - nâu đậm. Thời gian 6 - 7 ngày.</w:t>
+      </w:r>
+    </w:p>
+    <w:p>
+      <w:r>
+        <w:t>             3. Tập quán sinh sống và gây hại</w:t>
+      </w:r>
+      <w:r>
+        <w:t xml:space="preserve"> của sâu cuốn lá nhỏ</w:t>
+      </w:r>
+    </w:p>
+    <w:p>
+      <w:r>
+        <w:t>            - Bướm thường vũ hóa về ban đêm, từ 9 giờ tối đến sáng hôm sau. Ban ngày trưởng thành ẩn mình trong khóm lúa hoặc cỏ dại; khi bị tác động, bay một đoạn ngắn trên lá lúa.</w:t>
+      </w:r>
+    </w:p>
+    <w:p>
+      <w:r>
+        <w:t>            + Tất cả những hoạt động như giao phối, đẻ trứng thường diễn ra vào ban đêm.</w:t>
+      </w:r>
+    </w:p>
+    <w:p>
+      <w:r>
+        <w:t>           + Bướm bị ánh sáng đèn thu hút, nhất là trưởng thành cái, trưởng thành cái đẻ trứng ở các ruộng lúa hoặc mạ có màu xanh đậm, rậm rạp và thích tập trung nhiều ở những ruộng gần bờ mương, gần nhà ở hoặc đường đi có bóng mát.</w:t>
+      </w:r>
+    </w:p>
+    <w:p>
+      <w:r>
+        <w:lastRenderedPageBreak/>
+        <w:t>            - Sâu non mới nở rất nhanh nhẹn, bò khắp trên lá, thân cây và chui vào lá non ăn phần xanh, chừa lại lớp màng trắng mỏng trên lá lúa.</w:t>
+      </w:r>
+    </w:p>
+    <w:p>
+      <w:r>
+        <w:t>           + Sâu non tuổi 2, bò đến các lá già nhả tơ ở khoảng giữa 2 bìa lá lúa, sợi tơ gặp không khí khô và rút 2 bìa lá lại, mặt trên lá cuốn vào bên trong thành một cái bao theo chiều dọc lá lúa, sâu ẩn trong đó và ăn phần xanh của lá để sinh sống; thường có 1 sâu non trong 1 bao lá.</w:t>
+      </w:r>
+    </w:p>
+    <w:p>
+      <w:r>
+        <w:t>          + Sâu tuổi lớn có thể gây hại 1 - 2 lá lúa trong một ngày và có khả năng nhả tơ gập lá theo chiều ngang, đôi khi chập 2 - 5 lá cuốn thành 1 bao.</w:t>
+      </w:r>
+    </w:p>
+    <w:p>
+      <w:r>
+        <w:t>         + Sâu nằm trong bao, ăn phá suốt ngày đêm; có thể di chuyển hẳn ra khỏi bao cũ để gây hại các lá mới. Một con sâu từ khi nở đến khi hóa nhộng có thể gây hại từ 3 - 5 lá.</w:t>
+      </w:r>
+    </w:p>
+    <w:p>
+      <w:r>
+        <w:t>       + Sâu thường di chuyển vào buổi chiều, nếu trong ngày trời mưa hoặc râm mát, sâu có thể di chuyển bất cứ lúc nào. Sâu non lớn đẫy sức chuyển từ màu xanh sang vàng hồng và có thể hóa nhộng ngay tại nơi sinh sống hoặc chui ra khỏi bao cũ tìm vị trí khác hóa nhộng.</w:t>
+      </w:r>
+    </w:p>
+    <w:p>
+      <w:r>
+        <w:t>         + Sâu có thể nhả tơ, cắn đứt hai đầu lá và bịt lại thành bao kín để hóa nhộng bên trong. Lá lúa bị sâu gây hại sẽ khô, cây héo, giảm năng suất, nhất là khi sâu gây hại lá đòng và lá công năng.</w:t>
+      </w:r>
+    </w:p>
+    <w:p>
+      <w:r>
+        <w:t>            4. Biện pháp phòng trừ</w:t>
+      </w:r>
+      <w:r>
+        <w:t xml:space="preserve"> sâu cuốn lá nhỏ</w:t>
+      </w:r>
+    </w:p>
+    <w:p>
+      <w:r>
+        <w:t>            4.1. Biện pháp canh tác, kỹ thuật</w:t>
+      </w:r>
+    </w:p>
+    <w:p>
+      <w:r>
+        <w:t>         Vệ sinh đồng ruộng, làm sạch cỏ dại, gieo trồng và chăm sóc lúa hợp lý; sử dụng phân bón cho lúa hiệu quả nhằm cung cấp đầy đủ, cân đối dinh dưỡng cho cây lúa ngay từ đầu, tạo điều kiện cho cây lúa phát triển khỏe mạnh, cứng cáp, hạn chế sâu, bệnh hại.</w:t>
+      </w:r>
+    </w:p>
+    <w:p>
+      <w:r>
+        <w:t>            4.2. Biện pháp sinh học</w:t>
+      </w:r>
+      <w:r>
+        <w:t xml:space="preserve"> phòng trừ sâu cuốn lá nhỏ</w:t>
+      </w:r>
+    </w:p>
+    <w:p>
+      <w:r>
+        <w:t>          Chú ý bảo vệ hoặc bổ sung thiên địch như ong mắt đỏ Trichogramma sp., nấm… Ký sinh thiên địch của sâu cuốn lá nhỏ rất đa dạng từ các loài ong, nấm, các loài ăn thịt…</w:t>
+      </w:r>
+    </w:p>
+    <w:p>
+      <w:r>
+        <w:t>           4.3. Biện pháp hóa học</w:t>
+      </w:r>
+      <w:r>
+        <w:t xml:space="preserve"> phòng trừ sâu cuốn lá nhỏ</w:t>
+      </w:r>
+    </w:p>
+    <w:p>
+      <w:r>
+        <w:t>           Dùng các loại thuốc đặc trị sâu cuốn lá nhỏ, gồm:</w:t>
+      </w:r>
+    </w:p>
+    <w:p>
+      <w:r>
+        <w:t>          + Director 70EC: Liều lượng: 0.3 lít/ ha. Pha 12.5ml/ bình 25 lít nước phun cho 500 </w:t>
+      </w:r>
+      <w:r>
+        <w:rPr>
+          <w:lang w:val="vi-VN"/>
+        </w:rPr>
+        <w:t>m</w:t>
+      </w:r>
+      <w:r>
+        <w:rPr>
+          <w:vertAlign w:val="superscript"/>
+          <w:lang w:val="vi-VN"/>
+        </w:rPr>
+        <w:t>2</w:t>
+      </w:r>
+      <w:r>
+        <w:t>.</w:t>
+      </w:r>
+    </w:p>
+    <w:p>
+      <w:r>
+        <w:t>          + In Cipio 200SC: Liều lượng: 0,1 lít/ha. Pha 5ml thuốc với 16 lít nước, phun cho 360 </w:t>
+      </w:r>
+      <w:r>
+        <w:rPr>
+          <w:lang w:val="vi-VN"/>
+        </w:rPr>
+        <w:t>m</w:t>
+      </w:r>
+      <w:r>
+        <w:rPr>
+          <w:vertAlign w:val="superscript"/>
+          <w:lang w:val="vi-VN"/>
+        </w:rPr>
+        <w:t>2</w:t>
+      </w:r>
+      <w:r>
+        <w:t>.</w:t>
+      </w:r>
+    </w:p>
+    <w:p>
+      <w:r>
+        <w:lastRenderedPageBreak/>
+        <w:t>           + Clever 150SC: Liều lượng: 140 - 200 ml/ha. Pha 6ml thuốc với 16 lít nước, phun cho 360 </w:t>
+      </w:r>
+      <w:r>
+        <w:rPr>
+          <w:lang w:val="vi-VN"/>
+        </w:rPr>
+        <w:t>m</w:t>
+      </w:r>
+      <w:r>
+        <w:rPr>
+          <w:vertAlign w:val="superscript"/>
+          <w:lang w:val="vi-VN"/>
+        </w:rPr>
+        <w:t>2</w:t>
+      </w:r>
+      <w:r>
+        <w:t>.</w:t>
+      </w:r>
+    </w:p>
+    <w:p>
+      <w:r>
+        <w:t>           + Solo 350SC: Liều lượng: 0.25-0.3 lít/ha. Pha 1 gói 20ml với 25 lít nước, phun cho 500 </w:t>
+      </w:r>
+      <w:r>
+        <w:rPr>
+          <w:lang w:val="vi-VN"/>
+        </w:rPr>
+        <w:t>m</w:t>
+      </w:r>
+      <w:r>
+        <w:rPr>
+          <w:vertAlign w:val="superscript"/>
+          <w:lang w:val="vi-VN"/>
+        </w:rPr>
+        <w:t>2</w:t>
+      </w:r>
+    </w:p>
+    <w:p>
+      <w:r>
+        <w:t>            + Chlorin 10SC: Liều lượng: 0,75 lít/ha. Pha 1 gói 25ml với 16 lít nước, phun cho 360 </w:t>
+      </w:r>
+      <w:r>
+        <w:rPr>
+          <w:lang w:val="vi-VN"/>
+        </w:rPr>
+        <w:t>m</w:t>
+      </w:r>
+      <w:r>
+        <w:rPr>
+          <w:vertAlign w:val="superscript"/>
+          <w:lang w:val="vi-VN"/>
+        </w:rPr>
+        <w:t>2</w:t>
+      </w:r>
+      <w:r>
+        <w:t>.</w:t>
+      </w:r>
+    </w:p>
+    <w:p>
+      <w:r>
+        <w:t>             + Sunnet 300WG: Liều lượng: Pha 3,8g cho bình 16 lít nước, phun cho 360 </w:t>
+      </w:r>
+      <w:r>
+        <w:rPr>
+          <w:lang w:val="vi-VN"/>
+        </w:rPr>
+        <w:t>m</w:t>
+      </w:r>
+      <w:r>
+        <w:rPr>
+          <w:vertAlign w:val="superscript"/>
+          <w:lang w:val="vi-VN"/>
+        </w:rPr>
+        <w:t>2</w:t>
+      </w:r>
+      <w:r>
+        <w:t>.</w:t>
+      </w:r>
+    </w:p>
+    <w:p>
+      <w:r>
+        <w:t>             + Ammate 150EC: Liều lượng: 0,1-0,14 lít/ha. Pha 5ml cho bình 16 lít nước, phun cho 360 </w:t>
+      </w:r>
+      <w:r>
+        <w:rPr>
+          <w:lang w:val="vi-VN"/>
+        </w:rPr>
+        <w:t>m</w:t>
+      </w:r>
+      <w:r>
+        <w:rPr>
+          <w:vertAlign w:val="superscript"/>
+          <w:lang w:val="vi-VN"/>
+        </w:rPr>
+        <w:t>2</w:t>
+      </w:r>
+      <w:r>
+        <w:t>.</w:t>
+      </w:r>
+    </w:p>
+    <w:p>
+      <w:r>
+        <w:t>             + Obaone 95WG: Liều lượng: 0.15 – 0.25 kg/ha. Pha 10 gam cho bình 16 lít nước, phun cho 360 </w:t>
+      </w:r>
+      <w:r>
+        <w:rPr>
+          <w:lang w:val="vi-VN"/>
+        </w:rPr>
+        <w:t>m</w:t>
+      </w:r>
+      <w:r>
+        <w:rPr>
+          <w:vertAlign w:val="superscript"/>
+          <w:lang w:val="vi-VN"/>
+        </w:rPr>
+        <w:t>2</w:t>
+      </w:r>
+      <w:r>
+        <w:t>.</w:t>
+      </w:r>
+    </w:p>
+    <w:p>
+      <w:r>
+        <w:t> 5. Một số lưu ý khi phun thuốc</w:t>
+      </w:r>
+      <w:r>
+        <w:t xml:space="preserve"> phòng trừ sâu cuốn lá nhỏ</w:t>
+      </w:r>
+    </w:p>
+    <w:p>
+      <w:r>
+        <w:t>          - Mật độ phun trừ sâu cuốn lá nhỏ: từ 50 con/</w:t>
+      </w:r>
+      <w:r>
+        <w:rPr>
+          <w:lang w:val="vi-VN"/>
+        </w:rPr>
+        <w:t>m</w:t>
+      </w:r>
+      <w:r>
+        <w:rPr>
+          <w:vertAlign w:val="superscript"/>
+          <w:lang w:val="vi-VN"/>
+        </w:rPr>
+        <w:t>2</w:t>
+      </w:r>
+      <w:r>
+        <w:t> trở lên đối với giai đoạn đẻ nhánh, từ 20 con/</w:t>
+      </w:r>
+      <w:r>
+        <w:rPr>
+          <w:lang w:val="vi-VN"/>
+        </w:rPr>
+        <w:t>m</w:t>
+      </w:r>
+      <w:r>
+        <w:rPr>
+          <w:vertAlign w:val="superscript"/>
+          <w:lang w:val="vi-VN"/>
+        </w:rPr>
+        <w:t>2</w:t>
+      </w:r>
+      <w:r>
+        <w:t> trở lên đối với giai đoạn làm đòng.</w:t>
+      </w:r>
+    </w:p>
+    <w:p>
+      <w:r>
+        <w:t>         - Phun thuốc ướt đẫm đều thân, lá lúa. Phun khi sâu non mới nở, tuổi nhỏ (tuổi 1-3) hoặc sau cao điểm bướm rộ 5 - 7 ngày; nếu mật độ sâu cao, xen gối lứa kéo dài nên phun thêm lần 2 sau 5 - 7 ngày. Sau khi phun thuốc 3-5 giờ, gặp mưa thì cần phải phun lại.</w:t>
+      </w:r>
+    </w:p>
+    <w:p>
+      <w:r>
+        <w:t>         - Phun thuốc tuân thủ nguyên tắc 4 đúng “ Đúng thuốc, đúng lúc, đúng liều lượng, nồng độ, đúng kỹ thuật”. Cần đeo khẩu trang, bao tay, đồ bảo hộ để tránh hóa chất độc hại tiếp xúc trực tiếp đến cơ thể. Không phun ngược chiều gió. Không phun thuốc dưới nhiệt độ cao.</w:t>
+      </w:r>
+    </w:p>
+    <w:p>
+      <w:r>
+        <w:t>       - Nên ứng dụng máy bay không người lái phun trừ, pha thuốc đúng kỹ thuật, hạn chế ảnh hưởng tới sức khỏe người phun, tăng hiệu quả phòng trừ, tiết kiệm thuốc, giảm chi phí công lao động.</w:t>
+      </w:r>
+    </w:p>
+    <w:p>
+      <w:pPr>
+        <w:rPr>
+          <w:lang w:val="vi-VN"/>
+        </w:rPr>
+      </w:pPr>
+    </w:p>
+    <w:p>
+      <w:pPr>
+        <w:rPr>
+          <w:lang w:val="vi-VN"/>
+        </w:rPr>
+      </w:pPr>
+      <w:r>
+        <w:rPr>
+          <w:lang w:val="vi-VN"/>
+        </w:rPr>
+        <w:t>PHẦN 1:</w:t>
+      </w:r>
+    </w:p>
+    <w:p>
+      <w:pPr>
+        <w:rPr>
+          <w:lang w:val="vi-VN"/>
+        </w:rPr>
+      </w:pPr>
+      <w:r>
+        <w:rPr>
+          <w:lang w:val="vi-VN"/>
+        </w:rPr>
+        <w:t>PHÒNG TRỪ RẦY NÂU TRUYỀN BỆNH VÀNG LÙN, LÙN XOẮN LÁ</w:t>
+      </w:r>
+    </w:p>
+    <w:p>
+      <w:pPr>
+        <w:rPr>
+          <w:lang w:val="vi-VN"/>
+        </w:rPr>
+      </w:pPr>
+      <w:r>
+        <w:rPr>
+          <w:lang w:val="vi-VN"/>
+        </w:rPr>
+        <w:t>1. Mô tả rầy nâu</w:t>
+      </w:r>
+    </w:p>
+    <w:p>
+      <w:pPr>
+        <w:rPr>
+          <w:lang w:val="vi-VN"/>
+        </w:rPr>
+      </w:pPr>
+      <w:r>
+        <w:rPr>
+          <w:lang w:val="vi-VN"/>
+        </w:rPr>
+        <w:t>Rầy trưởng thành cánh dài xâm nhập vào ruộng lúa và đẻ trứng trên các bẹ lá hoặc ở các gân</w:t>
+      </w:r>
+      <w:r>
+        <w:rPr>
+          <w:lang w:val="vi-VN"/>
+        </w:rPr>
         <w:t xml:space="preserve"> </w:t>
       </w:r>
       <w:r>
-        <w:t>Bệnh Lùn Sọc Đen (LSĐ)</w:t>
-      </w:r>
-      <w:r>
-        <w:t>: Cây thấp lùn, lá xanh đậm, có thể xoăn ở đầu lá. Đặc trưng là xuất hiện các u sáp và sọc đen trên bẹ và lóng thân. Cây bị bệnh nặng không trổ bông được hoặc hạt bị đen.</w:t>
-      </w:r>
-    </w:p>
-    <w:p/>
-    <w:p>
-      <w:r>
-        <w:t>Nguồn tài liệu</w:t>
-      </w:r>
-      <w:r>
-        <w:t xml:space="preserve"> Bệnh Lùn Sọc Đen (LSĐ)</w:t>
-      </w:r>
-      <w:r>
-        <w:t>:</w:t>
-      </w:r>
-    </w:p>
-    <w:p/>
-    <w:p>
-      <w:r>
-        <w:t>Biện pháp phòng trừ bệnh lùn sọc đen hại ngô, lúa vụ Đông Xuân - Trung tâm Khuyến nông Quốc gia.</w:t>
-      </w:r>
-    </w:p>
-    <w:p/>
-    <w:p>
-      <w:r>
-        <w:t>Biện pháp phòng, trừ bệnh lùn sọc đen hại lúa - Báo điện tử Chính phủ.</w:t>
-      </w:r>
-    </w:p>
-    <w:p/>
-    <w:p>
-      <w:r>
-        <w:t xml:space="preserve">Biện pháp quản lý cho các nhóm bệnh về virus </w:t>
-      </w:r>
-      <w:r>
-        <w:t>như Tungro, vàng lùn và lùn lá xoắn, lùn sọc đen</w:t>
-      </w:r>
-      <w:r>
-        <w:t xml:space="preserve"> (bệnh do virus gây ra không có thuốc đặc trị</w:t>
-      </w:r>
-      <w:r>
+        <w:rPr>
+          <w:lang w:val="vi-VN"/>
+        </w:rPr>
+        <w:t>lá. Trứng xếp hình nải chuối. Rầy non tuổi 1 có màu trắng, các tuổi sau có màu vàng nâu.</w:t>
+      </w:r>
+    </w:p>
+    <w:p>
+      <w:pPr>
+        <w:rPr>
+          <w:lang w:val="vi-VN"/>
+        </w:rPr>
+      </w:pPr>
+      <w:r>
+        <w:rPr>
+          <w:lang w:val="vi-VN"/>
+        </w:rPr>
+        <w:lastRenderedPageBreak/>
+        <w:t>Rầy trưởng thành có hai loại: cánh dài và cánh ngắn. Rầy trưởng thành cánh ngắn xuất</w:t>
+      </w:r>
+      <w:r>
+        <w:rPr>
+          <w:lang w:val="vi-VN"/>
+        </w:rPr>
         <w:t xml:space="preserve"> </w:t>
       </w:r>
       <w:r>
-        <w:t>do đó biện pháp phòng trừ chính là quản lý môi giới truyền bệnh</w:t>
-      </w:r>
-      <w:r>
-        <w:t>):</w:t>
-      </w:r>
-    </w:p>
-    <w:p>
-      <w:r>
-        <w:t>Thăm đồng thường xuyên để phát hiện sớm rầy.</w:t>
-      </w:r>
-    </w:p>
-    <w:p/>
-    <w:p>
-      <w:r>
-        <w:t>Sử dụng giống kháng rầy.</w:t>
-      </w:r>
-    </w:p>
-    <w:p/>
-    <w:p>
-      <w:r>
-        <w:t>Bảo vệ thiên địch của rầy.</w:t>
-      </w:r>
-    </w:p>
-    <w:p/>
-    <w:p>
-      <w:r>
-        <w:t>Nhổ bỏ và tiêu hủy sớm những cây bị bệnh để tránh lây lan.</w:t>
-      </w:r>
-    </w:p>
-    <w:p/>
-    <w:p>
-      <w:r>
-        <w:t>Sử dụng thuốc trừ rầy khi mật độ cao theo nguyên tắc "4 đúng".</w:t>
+        <w:rPr>
+          <w:lang w:val="vi-VN"/>
+        </w:rPr>
+        <w:t>hiện phổ biến trước lúc trổ bông, rầy cánh dài thường xuất hiện vào giai đoạn lúa chín và di chuyển, phát</w:t>
+      </w:r>
+      <w:r>
+        <w:rPr>
+          <w:lang w:val="vi-VN"/>
+        </w:rPr>
+        <w:t xml:space="preserve"> </w:t>
+      </w:r>
+      <w:r>
+        <w:rPr>
+          <w:lang w:val="vi-VN"/>
+        </w:rPr>
+        <w:t>tán.</w:t>
+      </w:r>
+    </w:p>
+    <w:p>
+      <w:pPr>
+        <w:rPr>
+          <w:lang w:val="vi-VN"/>
+        </w:rPr>
+      </w:pPr>
+      <w:r>
+        <w:rPr>
+          <w:lang w:val="vi-VN"/>
+        </w:rPr>
+        <w:t>2. Vòng đời rầy nâu:</w:t>
+      </w:r>
+    </w:p>
+    <w:p>
+      <w:pPr>
+        <w:rPr>
+          <w:lang w:val="vi-VN"/>
+        </w:rPr>
+      </w:pPr>
+      <w:r>
+        <w:rPr>
+          <w:lang w:val="vi-VN"/>
+        </w:rPr>
+        <w:t>Vòng đời của rầy nâu từ 25 - 28 ngày, trong điều kiện nhiệt độ 25 - 30oC.</w:t>
+      </w:r>
+    </w:p>
+    <w:p>
+      <w:pPr>
+        <w:rPr>
+          <w:lang w:val="vi-VN"/>
+        </w:rPr>
+      </w:pPr>
+      <w:r>
+        <w:rPr>
+          <w:lang w:val="vi-VN"/>
+        </w:rPr>
+        <w:t>3. Đặc điểm gây hại</w:t>
+      </w:r>
+    </w:p>
+    <w:p>
+      <w:pPr>
+        <w:rPr>
+          <w:lang w:val="vi-VN"/>
+        </w:rPr>
+      </w:pPr>
+      <w:r>
+        <w:rPr>
+          <w:lang w:val="vi-VN"/>
+        </w:rPr>
+        <w:t>a. Tác hại trực tiếp: rầy cám và rầy trưởng thành cánh dài hoặc cánh ngắn đều chích hút nhựa cây</w:t>
+      </w:r>
+      <w:r>
+        <w:rPr>
+          <w:lang w:val="vi-VN"/>
+        </w:rPr>
+        <w:t xml:space="preserve"> </w:t>
+      </w:r>
+      <w:r>
+        <w:rPr>
+          <w:lang w:val="vi-VN"/>
+        </w:rPr>
+        <w:t>lúa gây ra hiện tượng cháy rầy khi mật số cao. Rầy nâu gia tăng mật số nhanh và cao (bột phát) gây hại</w:t>
+      </w:r>
+      <w:r>
+        <w:rPr>
+          <w:lang w:val="vi-VN"/>
+        </w:rPr>
+        <w:t xml:space="preserve"> </w:t>
+      </w:r>
+      <w:r>
+        <w:rPr>
+          <w:lang w:val="vi-VN"/>
+        </w:rPr>
+        <w:t>nặng cho cây lúa khi:</w:t>
+      </w:r>
+    </w:p>
+    <w:p>
+      <w:pPr>
+        <w:rPr>
+          <w:lang w:val="vi-VN"/>
+        </w:rPr>
+      </w:pPr>
+      <w:r>
+        <w:rPr>
+          <w:lang w:val="vi-VN"/>
+        </w:rPr>
+        <w:t>- Trồng lúa liên tục trong năm,</w:t>
+      </w:r>
+    </w:p>
+    <w:p>
+      <w:pPr>
+        <w:rPr>
+          <w:lang w:val="vi-VN"/>
+        </w:rPr>
+      </w:pPr>
+      <w:r>
+        <w:rPr>
+          <w:lang w:val="vi-VN"/>
+        </w:rPr>
+        <w:t>- Dùng giống nhiễm rầy,</w:t>
+      </w:r>
+    </w:p>
+    <w:p>
+      <w:pPr>
+        <w:rPr>
+          <w:lang w:val="vi-VN"/>
+        </w:rPr>
+      </w:pPr>
+      <w:r>
+        <w:rPr>
+          <w:lang w:val="vi-VN"/>
+        </w:rPr>
+        <w:t>- Gieo sạ mật độ dày,</w:t>
+      </w:r>
+    </w:p>
+    <w:p>
+      <w:pPr>
+        <w:rPr>
+          <w:lang w:val="vi-VN"/>
+        </w:rPr>
+      </w:pPr>
+      <w:r>
+        <w:rPr>
+          <w:lang w:val="vi-VN"/>
+        </w:rPr>
+        <w:t>- Bón dư thừa phân đạm,</w:t>
+      </w:r>
+    </w:p>
+    <w:p>
+      <w:pPr>
+        <w:rPr>
+          <w:lang w:val="vi-VN"/>
+        </w:rPr>
+      </w:pPr>
+      <w:r>
+        <w:rPr>
+          <w:lang w:val="vi-VN"/>
+        </w:rPr>
+        <w:t>- Phun thuốc trừ sâu không đúng cách (trộn nhiều loại thuốc, phun nhiều lần…).</w:t>
+      </w:r>
+    </w:p>
+    <w:p>
+      <w:pPr>
+        <w:rPr>
+          <w:lang w:val="vi-VN"/>
+        </w:rPr>
+      </w:pPr>
+      <w:r>
+        <w:rPr>
+          <w:lang w:val="vi-VN"/>
+        </w:rPr>
+        <w:t>b. Tác hại gián tiếp: là môi giới truyền vi rút gây bệnh vàng lùn, lùn xoắn lá cho cây lúa.</w:t>
+      </w:r>
+    </w:p>
+    <w:p>
+      <w:pPr>
+        <w:rPr>
+          <w:lang w:val="vi-VN"/>
+        </w:rPr>
+      </w:pPr>
+      <w:r>
+        <w:rPr>
+          <w:lang w:val="vi-VN"/>
+        </w:rPr>
+        <w:t>4. Đặc điểm truyền bệnh</w:t>
+      </w:r>
+      <w:r>
+        <w:rPr>
+          <w:lang w:val="vi-VN"/>
+        </w:rPr>
+        <w:t xml:space="preserve"> của rầy nâu</w:t>
+      </w:r>
+    </w:p>
+    <w:p>
+      <w:pPr>
+        <w:rPr>
+          <w:lang w:val="vi-VN"/>
+        </w:rPr>
+      </w:pPr>
+      <w:r>
+        <w:rPr>
+          <w:lang w:val="vi-VN"/>
+        </w:rPr>
+        <w:t>Rầy nâu chích hút nhựa cây lúa bị bệnh vàng lùn, lùn xoắn lá rồi mang mầm bệnh vi rút này trong</w:t>
+      </w:r>
+      <w:r>
+        <w:rPr>
+          <w:lang w:val="vi-VN"/>
+        </w:rPr>
+        <w:t xml:space="preserve"> </w:t>
+      </w:r>
+      <w:r>
+        <w:rPr>
+          <w:lang w:val="vi-VN"/>
+        </w:rPr>
+        <w:t>cơ thể để truyền sang cho cây lúa khoẻ mạnh khi chúng đến chích hút cây lúa đó.</w:t>
+      </w:r>
+    </w:p>
+    <w:p>
+      <w:pPr>
+        <w:rPr>
+          <w:lang w:val="vi-VN"/>
+        </w:rPr>
+      </w:pPr>
+      <w:r>
+        <w:rPr>
+          <w:lang w:val="vi-VN"/>
+        </w:rPr>
+        <w:t>Rầy nâu mang mầm bệnh có khả năng truyền bệnh cho đến khi chết.</w:t>
+      </w:r>
+    </w:p>
+    <w:p>
+      <w:pPr>
+        <w:rPr>
+          <w:lang w:val="vi-VN"/>
+        </w:rPr>
+      </w:pPr>
+      <w:r>
+        <w:rPr>
+          <w:lang w:val="vi-VN"/>
+        </w:rPr>
+        <w:t>Cây lúa càng non càng dễ bị nhiễm bệnh, về sau có thể không trổ bông được, năng suất giảm</w:t>
+      </w:r>
+      <w:r>
+        <w:rPr>
+          <w:lang w:val="vi-VN"/>
+        </w:rPr>
+        <w:t xml:space="preserve"> </w:t>
+      </w:r>
+      <w:r>
+        <w:rPr>
+          <w:lang w:val="vi-VN"/>
+        </w:rPr>
+        <w:t>nghiêm trọng hoặc mất trắng. Cây lúa già bị nhiễm bệnh thì năng suất bị giảm ít hơn.</w:t>
+      </w:r>
+    </w:p>
+    <w:p>
+      <w:pPr>
+        <w:rPr>
+          <w:lang w:val="vi-VN"/>
+        </w:rPr>
+      </w:pPr>
+      <w:r>
+        <w:rPr>
+          <w:lang w:val="vi-VN"/>
+        </w:rPr>
+        <w:t>Tóm lại, rầy nâu chỉ truyền bệnh khi có nguồn bệnh (lúa bị bệnh, lúa chét bị bệnh, cỏ bị bệnh) tồn tại</w:t>
+      </w:r>
+      <w:r>
+        <w:rPr>
+          <w:lang w:val="vi-VN"/>
+        </w:rPr>
+        <w:t xml:space="preserve"> </w:t>
+      </w:r>
+      <w:r>
+        <w:rPr>
+          <w:lang w:val="vi-VN"/>
+        </w:rPr>
+        <w:t>trên đồng ruộng.</w:t>
+      </w:r>
+    </w:p>
+    <w:p>
+      <w:pPr>
+        <w:rPr>
+          <w:lang w:val="vi-VN"/>
+        </w:rPr>
+      </w:pPr>
+      <w:r>
+        <w:rPr>
+          <w:lang w:val="vi-VN"/>
+        </w:rPr>
+        <w:t>5. Phòng trừ rầy nâu truyền bệnh vàng lùn, lùn xoắn lá hại lúa</w:t>
+      </w:r>
+    </w:p>
+    <w:p>
+      <w:pPr>
+        <w:rPr>
+          <w:lang w:val="vi-VN"/>
+        </w:rPr>
+      </w:pPr>
+      <w:r>
+        <w:rPr>
+          <w:lang w:val="vi-VN"/>
+        </w:rPr>
+        <w:t>a. Các biện pháp phòng</w:t>
+      </w:r>
+    </w:p>
+    <w:p>
+      <w:pPr>
+        <w:rPr>
+          <w:lang w:val="vi-VN"/>
+        </w:rPr>
+      </w:pPr>
+      <w:r>
+        <w:rPr>
+          <w:lang w:val="vi-VN"/>
+        </w:rPr>
+        <w:t>- Không trồng lúa liên tục trong năm, bảo đảm thời gian cách ly giữa hai vụ lúa ít nhất 20-30 ngày,</w:t>
+      </w:r>
+      <w:r>
+        <w:rPr>
+          <w:lang w:val="vi-VN"/>
+        </w:rPr>
+        <w:t xml:space="preserve"> </w:t>
+      </w:r>
+      <w:r>
+        <w:rPr>
+          <w:lang w:val="vi-VN"/>
+        </w:rPr>
+        <w:t>không để vụ lúa chét. Theo sự phân vùng của ngành nông nghiệp, thời vụ trong cùng một vùng phải tập</w:t>
+      </w:r>
+      <w:r>
+        <w:rPr>
+          <w:lang w:val="vi-VN"/>
+        </w:rPr>
+        <w:t xml:space="preserve"> </w:t>
+      </w:r>
+      <w:r>
+        <w:rPr>
+          <w:lang w:val="vi-VN"/>
+        </w:rPr>
+        <w:t>trung, không được gieo sạ kéo dài;</w:t>
+      </w:r>
+    </w:p>
+    <w:p>
+      <w:pPr>
+        <w:rPr>
+          <w:lang w:val="vi-VN"/>
+        </w:rPr>
+      </w:pPr>
+      <w:r>
+        <w:rPr>
+          <w:lang w:val="vi-VN"/>
+        </w:rPr>
+        <w:lastRenderedPageBreak/>
+        <w:t>- Vệ sinh đồng ruộng bằng cách cày, trục kỹ trước khi gieo sạ, dọn sạch cỏ bờ ruộng, mương dẫn</w:t>
+      </w:r>
+      <w:r>
+        <w:rPr>
+          <w:lang w:val="vi-VN"/>
+        </w:rPr>
+        <w:t xml:space="preserve"> </w:t>
+      </w:r>
+      <w:r>
+        <w:rPr>
+          <w:lang w:val="vi-VN"/>
+        </w:rPr>
+        <w:t>nước;</w:t>
+      </w:r>
+    </w:p>
+    <w:p>
+      <w:pPr>
+        <w:rPr>
+          <w:lang w:val="vi-VN"/>
+        </w:rPr>
+      </w:pPr>
+      <w:r>
+        <w:rPr>
+          <w:lang w:val="vi-VN"/>
+        </w:rPr>
+        <w:t>- Sử dụng giống lúa kháng rầy, lúa giống có chất lượng tốt, không lấy lúa thịt làm lúa giống; nếu</w:t>
+      </w:r>
+      <w:r>
+        <w:rPr>
+          <w:lang w:val="vi-VN"/>
+        </w:rPr>
+        <w:t xml:space="preserve"> </w:t>
+      </w:r>
+      <w:r>
+        <w:rPr>
+          <w:lang w:val="vi-VN"/>
+        </w:rPr>
+        <w:t>điều kiện có thể sử dụng thuốc bảo vệ thực vật để xử lý hạt giống.</w:t>
+      </w:r>
+    </w:p>
+    <w:p>
+      <w:pPr>
+        <w:rPr>
+          <w:lang w:val="vi-VN"/>
+        </w:rPr>
+      </w:pPr>
+      <w:r>
+        <w:rPr>
+          <w:lang w:val="vi-VN"/>
+        </w:rPr>
+        <w:t>- Không gieo sạ quá dày trên 120 kg giống/ ha;</w:t>
+      </w:r>
+    </w:p>
+    <w:p>
+      <w:pPr>
+        <w:rPr>
+          <w:lang w:val="vi-VN"/>
+        </w:rPr>
+      </w:pPr>
+      <w:r>
+        <w:rPr>
+          <w:lang w:val="vi-VN"/>
+        </w:rPr>
+        <w:t>- Gieo sạ lúa vào thời gian có thể né rầy: thường mỗi tháng có một đợt rầy vào đèn rộ kéo dài từ 5 -</w:t>
+      </w:r>
+      <w:r>
+        <w:rPr>
+          <w:lang w:val="vi-VN"/>
+        </w:rPr>
+        <w:t xml:space="preserve"> </w:t>
+      </w:r>
+      <w:r>
+        <w:rPr>
+          <w:lang w:val="vi-VN"/>
+        </w:rPr>
+        <w:t>7 ngày; để né rầy thì gieo sạ ngay sau đỉnh cao rầy vào đèn. Như vậy, khi lúa non sẽ tránh được rầy</w:t>
+      </w:r>
+      <w:r>
+        <w:rPr>
+          <w:lang w:val="vi-VN"/>
+        </w:rPr>
+        <w:t xml:space="preserve"> </w:t>
+      </w:r>
+      <w:r>
+        <w:rPr>
+          <w:lang w:val="vi-VN"/>
+        </w:rPr>
+        <w:t>trưởng thành truyền bệnh.</w:t>
+      </w:r>
+    </w:p>
+    <w:p>
+      <w:pPr>
+        <w:rPr>
+          <w:lang w:val="vi-VN"/>
+        </w:rPr>
+      </w:pPr>
+      <w:r>
+        <w:rPr>
+          <w:lang w:val="vi-VN"/>
+        </w:rPr>
+        <w:t>- Để bảo vệ cây lúa non, sau khi sạ nên cho nước vào ruộng và duy trì mực nước thích hợp để hạn</w:t>
+      </w:r>
+      <w:r>
+        <w:rPr>
+          <w:lang w:val="vi-VN"/>
+        </w:rPr>
+        <w:t xml:space="preserve"> </w:t>
+      </w:r>
+      <w:r>
+        <w:rPr>
+          <w:lang w:val="vi-VN"/>
+        </w:rPr>
+        <w:t>chế rầy nâu chích hút thân cây lúa.</w:t>
+      </w:r>
+    </w:p>
+    <w:p>
+      <w:pPr>
+        <w:rPr>
+          <w:lang w:val="vi-VN"/>
+        </w:rPr>
+      </w:pPr>
+      <w:r>
+        <w:rPr>
+          <w:lang w:val="vi-VN"/>
+        </w:rPr>
+        <w:t>- Không bón quá thừa phân đạm (urê); tăng lượng phân lân và phân kali để nâng cao sức chống</w:t>
+      </w:r>
+      <w:r>
+        <w:rPr>
+          <w:lang w:val="vi-VN"/>
+        </w:rPr>
+        <w:t xml:space="preserve"> </w:t>
+      </w:r>
+      <w:r>
+        <w:rPr>
+          <w:lang w:val="vi-VN"/>
+        </w:rPr>
+        <w:t>chịu đối với bệnh.</w:t>
+      </w:r>
+    </w:p>
+    <w:p>
+      <w:pPr>
+        <w:rPr>
+          <w:lang w:val="vi-VN"/>
+        </w:rPr>
+      </w:pPr>
+      <w:r>
+        <w:rPr>
+          <w:lang w:val="vi-VN"/>
+        </w:rPr>
+        <w:t>- Thường xuyên thăm đồng để phát hiện sớm sự xuất hiện của rầy nâu trên cây lúa (phải vạch gốc</w:t>
+      </w:r>
+      <w:r>
+        <w:rPr>
+          <w:lang w:val="vi-VN"/>
+        </w:rPr>
+        <w:t xml:space="preserve"> </w:t>
+      </w:r>
+      <w:r>
+        <w:rPr>
+          <w:lang w:val="vi-VN"/>
+        </w:rPr>
+        <w:t>lúa để xem).</w:t>
+      </w:r>
+    </w:p>
+    <w:p>
+      <w:pPr>
+        <w:rPr>
+          <w:lang w:val="vi-VN"/>
+        </w:rPr>
+      </w:pPr>
+      <w:r>
+        <w:rPr>
+          <w:lang w:val="vi-VN"/>
+        </w:rPr>
+        <w:t>b. Biện pháp trừ bằng thuốc bảo vệ thực vật để dập dịch</w:t>
+      </w:r>
+    </w:p>
+    <w:p>
+      <w:pPr>
+        <w:rPr>
+          <w:lang w:val="vi-VN"/>
+        </w:rPr>
+      </w:pPr>
+      <w:r>
+        <w:rPr>
+          <w:lang w:val="vi-VN"/>
+        </w:rPr>
+        <w:t>Khi phát hiện có rầy trên lúa thì phun xịt thuốc bảo vệ thực vật để diệt rầy.</w:t>
+      </w:r>
+    </w:p>
+    <w:p>
+      <w:pPr>
+        <w:rPr>
+          <w:lang w:val="vi-VN"/>
+        </w:rPr>
+      </w:pPr>
+      <w:r>
+        <w:rPr>
+          <w:lang w:val="vi-VN"/>
+        </w:rPr>
+        <w:t>- Giai đoạn lúa từ sau gieo sạ đến 20 ngày: nếu phát hiện rầy nâu xuất hiện thì phun thuốc diệt trừ</w:t>
+      </w:r>
+    </w:p>
+    <w:p>
+      <w:pPr>
+        <w:rPr>
+          <w:lang w:val="vi-VN"/>
+        </w:rPr>
+      </w:pPr>
+      <w:r>
+        <w:rPr>
+          <w:lang w:val="vi-VN"/>
+        </w:rPr>
+        <w:t>bằng các loại thuốc phù hợp được trình bày ở Phụ lục.</w:t>
+      </w:r>
+    </w:p>
+    <w:p>
+      <w:pPr>
+        <w:rPr>
+          <w:lang w:val="vi-VN"/>
+        </w:rPr>
+      </w:pPr>
+      <w:r>
+        <w:rPr>
+          <w:lang w:val="vi-VN"/>
+        </w:rPr>
+        <w:t>- Giai đoạn từ sau 20 ngày đến trổ-chín: Giai đoạn này, nếu phát hiện rầy nâu với mật số từ 3</w:t>
+      </w:r>
+    </w:p>
+    <w:p>
+      <w:pPr>
+        <w:rPr>
+          <w:lang w:val="vi-VN"/>
+        </w:rPr>
+      </w:pPr>
+      <w:r>
+        <w:rPr>
+          <w:lang w:val="vi-VN"/>
+        </w:rPr>
+        <w:t>con/dảnh trở lên thì phun xịt thuốc trừ rầy.</w:t>
+      </w:r>
+    </w:p>
+    <w:p>
+      <w:pPr>
+        <w:rPr>
+          <w:lang w:val="vi-VN"/>
+        </w:rPr>
+      </w:pPr>
+      <w:r>
+        <w:rPr>
+          <w:lang w:val="vi-VN"/>
+        </w:rPr>
+        <w:t>Khi phun xịt thuốc trừ rầy phải theo “4 đúng”, gồm:</w:t>
+      </w:r>
+    </w:p>
+    <w:p>
+      <w:pPr>
+        <w:rPr>
+          <w:lang w:val="vi-VN"/>
+        </w:rPr>
+      </w:pPr>
+      <w:r>
+        <w:rPr>
+          <w:lang w:val="vi-VN"/>
+        </w:rPr>
+        <w:t>+ Đúng loại thuốc: theo khuyến cáo của cơ quan bảo vệ thực vật địa phương và tham khảo ở phần</w:t>
+      </w:r>
+    </w:p>
+    <w:p>
+      <w:pPr>
+        <w:rPr>
+          <w:lang w:val="vi-VN"/>
+        </w:rPr>
+      </w:pPr>
+      <w:r>
+        <w:rPr>
+          <w:lang w:val="vi-VN"/>
+        </w:rPr>
+        <w:t>Phụ lục, không pha trộn nhiều lọai thuốc để phun;</w:t>
+      </w:r>
+    </w:p>
+    <w:p>
+      <w:pPr>
+        <w:rPr>
+          <w:lang w:val="vi-VN"/>
+        </w:rPr>
+      </w:pPr>
+      <w:r>
+        <w:rPr>
+          <w:lang w:val="vi-VN"/>
+        </w:rPr>
+        <w:t>+ Đúng liều lượng: pha thuốc theo đúng liều lượng và phun đủ lượng nước thuốc pha theo hướng</w:t>
+      </w:r>
+    </w:p>
+    <w:p>
+      <w:pPr>
+        <w:rPr>
+          <w:lang w:val="vi-VN"/>
+        </w:rPr>
+      </w:pPr>
+      <w:r>
+        <w:rPr>
+          <w:lang w:val="vi-VN"/>
+        </w:rPr>
+        <w:t>dẫn ghi trên nhãn bao bì của mỗi loại thuốc;</w:t>
+      </w:r>
+    </w:p>
+    <w:p>
+      <w:pPr>
+        <w:rPr>
+          <w:lang w:val="vi-VN"/>
+        </w:rPr>
+      </w:pPr>
+      <w:r>
+        <w:rPr>
+          <w:lang w:val="vi-VN"/>
+        </w:rPr>
+        <w:t>+ Đúng lúc: khi phát hiện rầy cám ở tuổi 1-3, hoặc rầy trưởng thành chiếm đa số trong ruộng;</w:t>
+      </w:r>
+    </w:p>
+    <w:p>
+      <w:pPr>
+        <w:rPr>
+          <w:lang w:val="vi-VN"/>
+        </w:rPr>
+      </w:pPr>
+      <w:r>
+        <w:rPr>
+          <w:lang w:val="vi-VN"/>
+        </w:rPr>
+        <w:lastRenderedPageBreak/>
+        <w:t>+ Đúng cách: hướng vòi phun vào sát gốc lúa nơi rầy bu; không được phun trên ngọn lá lúa. Trước</w:t>
+      </w:r>
+    </w:p>
+    <w:p>
+      <w:pPr>
+        <w:rPr>
+          <w:lang w:val="vi-VN"/>
+        </w:rPr>
+      </w:pPr>
+      <w:r>
+        <w:rPr>
+          <w:lang w:val="vi-VN"/>
+        </w:rPr>
+        <w:t>khi phun thuốc nếu có điều kiện nên cho nước ngập ruộng để rầy di chuyển lên cao, xịt dễ trúng rầy hơn.Trung tâm Khuyến nông Quốc gia 5</w:t>
+      </w:r>
+    </w:p>
+    <w:p>
+      <w:pPr>
+        <w:rPr>
+          <w:lang w:val="vi-VN"/>
+        </w:rPr>
+      </w:pPr>
+      <w:r>
+        <w:rPr>
+          <w:lang w:val="vi-VN"/>
+        </w:rPr>
+        <w:t>PHẦN 2:</w:t>
+      </w:r>
+    </w:p>
+    <w:p>
+      <w:pPr>
+        <w:rPr>
+          <w:lang w:val="vi-VN"/>
+        </w:rPr>
+      </w:pPr>
+      <w:r>
+        <w:rPr>
+          <w:lang w:val="vi-VN"/>
+        </w:rPr>
+        <w:t>PHÒNG TRỪ BỆNH VÀNG LÙN VÀ</w:t>
+      </w:r>
+      <w:r>
+        <w:rPr>
+          <w:lang w:val="vi-VN"/>
+        </w:rPr>
+        <w:t xml:space="preserve"> </w:t>
+      </w:r>
+      <w:r>
+        <w:rPr>
+          <w:lang w:val="vi-VN"/>
+        </w:rPr>
+        <w:t>LÙN XOẮN LÁ</w:t>
+      </w:r>
+    </w:p>
+    <w:p>
+      <w:pPr>
+        <w:rPr>
+          <w:lang w:val="vi-VN"/>
+        </w:rPr>
+      </w:pPr>
+      <w:r>
+        <w:rPr>
+          <w:lang w:val="vi-VN"/>
+        </w:rPr>
+        <w:t>1. Bệnh vàng lùn</w:t>
+      </w:r>
+    </w:p>
+    <w:p>
+      <w:pPr>
+        <w:rPr>
+          <w:lang w:val="vi-VN"/>
+        </w:rPr>
+      </w:pPr>
+      <w:r>
+        <w:rPr>
+          <w:lang w:val="vi-VN"/>
+        </w:rPr>
+        <w:t>a. Tác nhân</w:t>
+      </w:r>
+    </w:p>
+    <w:p>
+      <w:pPr>
+        <w:rPr>
+          <w:lang w:val="vi-VN"/>
+        </w:rPr>
+      </w:pPr>
+      <w:r>
+        <w:rPr>
+          <w:lang w:val="vi-VN"/>
+        </w:rPr>
+        <w:t>Bệnh vàng lùn là một dạng triệu chứng do vi rút gây bệnh lúa cỏ có tên RGSV (Rice Grassy Stunt</w:t>
+      </w:r>
+    </w:p>
+    <w:p>
+      <w:pPr>
+        <w:rPr>
+          <w:lang w:val="vi-VN"/>
+        </w:rPr>
+      </w:pPr>
+      <w:r>
+        <w:rPr>
+          <w:lang w:val="vi-VN"/>
+        </w:rPr>
+        <w:t>Virus) gây ra.</w:t>
+      </w:r>
+    </w:p>
+    <w:p>
+      <w:pPr>
+        <w:rPr>
+          <w:lang w:val="vi-VN"/>
+        </w:rPr>
+      </w:pPr>
+      <w:r>
+        <w:rPr>
+          <w:lang w:val="vi-VN"/>
+        </w:rPr>
+        <w:t>b. Nhận dạng</w:t>
+      </w:r>
+    </w:p>
+    <w:p>
+      <w:pPr>
+        <w:rPr>
+          <w:lang w:val="vi-VN"/>
+        </w:rPr>
+      </w:pPr>
+      <w:r>
+        <w:rPr>
+          <w:lang w:val="vi-VN"/>
+        </w:rPr>
+        <w:t>Triệu chứng bệnh trên cây lúa biểu hiện như sau:</w:t>
+      </w:r>
+    </w:p>
+    <w:p>
+      <w:pPr>
+        <w:rPr>
+          <w:lang w:val="vi-VN"/>
+        </w:rPr>
+      </w:pPr>
+      <w:r>
+        <w:rPr>
+          <w:lang w:val="vi-VN"/>
+        </w:rPr>
+        <w:t>- Màu sắc của cây lúa bệnh:</w:t>
+      </w:r>
+    </w:p>
+    <w:p>
+      <w:pPr>
+        <w:rPr>
+          <w:lang w:val="vi-VN"/>
+        </w:rPr>
+      </w:pPr>
+      <w:r>
+        <w:rPr>
+          <w:lang w:val="vi-VN"/>
+        </w:rPr>
+        <w:t xml:space="preserve">Lá lúa từ xanh nhạt </w:t>
+      </w:r>
+      <w:r>
+        <w:rPr>
+          <w:lang w:val="vi-VN"/>
+        </w:rPr>
+        <w:t>đến</w:t>
+      </w:r>
+      <w:r>
+        <w:rPr>
+          <w:lang w:val="vi-VN"/>
+        </w:rPr>
+        <w:t xml:space="preserve"> Vàng nhạt</w:t>
+      </w:r>
+      <w:r>
+        <w:rPr>
+          <w:lang w:val="vi-VN"/>
+        </w:rPr>
+        <w:t xml:space="preserve"> đến</w:t>
+      </w:r>
+      <w:r>
+        <w:rPr>
+          <w:lang w:val="vi-VN"/>
+        </w:rPr>
+        <w:t xml:space="preserve"> Vàng cam </w:t>
+      </w:r>
+      <w:r>
+        <w:rPr>
+          <w:lang w:val="vi-VN"/>
+        </w:rPr>
+        <w:t>đến</w:t>
+      </w:r>
+      <w:r>
+        <w:rPr>
+          <w:lang w:val="vi-VN"/>
+        </w:rPr>
+        <w:t xml:space="preserve"> Vàng khô;</w:t>
+      </w:r>
+    </w:p>
+    <w:p>
+      <w:pPr>
+        <w:rPr>
+          <w:lang w:val="vi-VN"/>
+        </w:rPr>
+      </w:pPr>
+      <w:r>
+        <w:rPr>
+          <w:lang w:val="vi-VN"/>
+        </w:rPr>
+        <w:t>- Vị trí lá bị vàng: lá dưới bị vàng trước, lần lượt đến các lá bên trên;</w:t>
+      </w:r>
+    </w:p>
+    <w:p>
+      <w:pPr>
+        <w:rPr>
+          <w:lang w:val="vi-VN"/>
+        </w:rPr>
+      </w:pPr>
+      <w:r>
+        <w:rPr>
+          <w:lang w:val="vi-VN"/>
+        </w:rPr>
+        <w:t>- Vết vàng trên lá:từ chóp lá vàng lần vào bẹ;</w:t>
+      </w:r>
+    </w:p>
+    <w:p>
+      <w:pPr>
+        <w:rPr>
+          <w:lang w:val="vi-VN"/>
+        </w:rPr>
+      </w:pPr>
+      <w:r>
+        <w:rPr>
+          <w:lang w:val="vi-VN"/>
+        </w:rPr>
+        <w:t>- Đặc điểm của lá lúa bệnh: lá có khuynh hướng xòe ngang;</w:t>
+      </w:r>
+    </w:p>
+    <w:p>
+      <w:pPr>
+        <w:rPr>
+          <w:lang w:val="vi-VN"/>
+        </w:rPr>
+      </w:pPr>
+      <w:r>
+        <w:rPr>
+          <w:lang w:val="vi-VN"/>
+        </w:rPr>
+        <w:t>- Bệnh làm giảm chiều cao chồi lúa bệnh và giảm số chồi của bụ i lúa mắc bệnh;</w:t>
+      </w:r>
+    </w:p>
+    <w:p>
+      <w:pPr>
+        <w:rPr>
+          <w:lang w:val="vi-VN"/>
+        </w:rPr>
+      </w:pPr>
+      <w:r>
+        <w:rPr>
+          <w:lang w:val="vi-VN"/>
+        </w:rPr>
+        <w:t>- Ruộng lúa bệnh ngả màu vàng, chiều cao cây không đồng đều.</w:t>
+      </w:r>
+    </w:p>
+    <w:p>
+      <w:pPr>
+        <w:rPr>
+          <w:lang w:val="vi-VN"/>
+        </w:rPr>
+      </w:pPr>
+      <w:r>
+        <w:rPr>
+          <w:lang w:val="vi-VN"/>
+        </w:rPr>
+        <w:t>c. Cách lan truyền bệnh</w:t>
+      </w:r>
+    </w:p>
+    <w:p>
+      <w:pPr>
+        <w:rPr>
+          <w:lang w:val="vi-VN"/>
+        </w:rPr>
+      </w:pPr>
+      <w:r>
+        <w:rPr>
+          <w:lang w:val="vi-VN"/>
+        </w:rPr>
+        <w:t>- Rầy nâu là môi giới truyền vi rút gây bệnh cho cây lúa và truyền vi rút cho đến khi chết.</w:t>
+      </w:r>
+    </w:p>
+    <w:p>
+      <w:pPr>
+        <w:rPr>
+          <w:lang w:val="vi-VN"/>
+        </w:rPr>
+      </w:pPr>
+      <w:r>
+        <w:rPr>
+          <w:lang w:val="vi-VN"/>
+        </w:rPr>
+        <w:t>- Cây lúa bị bệnh mang vi rút cho đến khi gặt, lúa chét cũng có thể nhiễm bệnh. Khi bị bệnh ở giai</w:t>
+      </w:r>
+    </w:p>
+    <w:p>
+      <w:pPr>
+        <w:rPr>
+          <w:lang w:val="vi-VN"/>
+        </w:rPr>
+      </w:pPr>
+      <w:r>
+        <w:rPr>
+          <w:lang w:val="vi-VN"/>
+        </w:rPr>
+        <w:t>đọan lúa non, lúa sẽ không trổ bông, năng suất giảm nghiêm trọng hoặc mất trắng.</w:t>
+      </w:r>
+    </w:p>
+    <w:p>
+      <w:pPr>
+        <w:rPr>
+          <w:lang w:val="vi-VN"/>
+        </w:rPr>
+      </w:pPr>
+      <w:r>
+        <w:rPr>
+          <w:lang w:val="vi-VN"/>
+        </w:rPr>
+        <w:t>- Rầy nâu chích hút cây lúa bệnh sau 5-10 phút là mang mầm bệnh trong cơ thể; và khỏang 10 ngày</w:t>
+      </w:r>
+    </w:p>
+    <w:p>
+      <w:pPr>
+        <w:rPr>
+          <w:lang w:val="vi-VN"/>
+        </w:rPr>
+      </w:pPr>
+      <w:r>
+        <w:rPr>
+          <w:lang w:val="vi-VN"/>
+        </w:rPr>
+        <w:t>sau là có thể lan truyền vi rút gây bệnh sang cây lúa khỏe khác.</w:t>
+      </w:r>
+    </w:p>
+    <w:p>
+      <w:pPr>
+        <w:rPr>
+          <w:lang w:val="vi-VN"/>
+        </w:rPr>
+      </w:pPr>
+      <w:r>
+        <w:rPr>
+          <w:lang w:val="vi-VN"/>
+        </w:rPr>
+        <w:lastRenderedPageBreak/>
+        <w:t>- Vi rút gây bệnh không truyền qua trứng rầy, đất, nước, không khí.</w:t>
+      </w:r>
+    </w:p>
+    <w:p>
+      <w:pPr>
+        <w:rPr>
+          <w:lang w:val="vi-VN"/>
+        </w:rPr>
+      </w:pPr>
+      <w:r>
+        <w:rPr>
+          <w:lang w:val="vi-VN"/>
+        </w:rPr>
+        <w:t>- Rầy nâu cánh dài mang vi rút phát tán đi rất xa nên phạm vi lây lan của bệnh rộng, rầy cánh ngắn</w:t>
+      </w:r>
+    </w:p>
+    <w:p>
+      <w:pPr>
+        <w:rPr>
+          <w:lang w:val="vi-VN"/>
+        </w:rPr>
+      </w:pPr>
+      <w:r>
+        <w:rPr>
+          <w:lang w:val="vi-VN"/>
+        </w:rPr>
+        <w:t>mang vi rút lây lan bệnh trong phạm vi hẹp vì không thể di chuyển xa.</w:t>
+      </w:r>
+    </w:p>
+    <w:p>
+      <w:pPr>
+        <w:rPr>
+          <w:lang w:val="vi-VN"/>
+        </w:rPr>
+      </w:pPr>
+      <w:r>
+        <w:rPr>
+          <w:lang w:val="vi-VN"/>
+        </w:rPr>
+        <w:t>- Hiện chưa có thuốc đặc trị vi rút gây bệnh.</w:t>
+      </w:r>
+    </w:p>
+    <w:p>
+      <w:pPr>
+        <w:rPr>
+          <w:lang w:val="vi-VN"/>
+        </w:rPr>
+      </w:pPr>
+      <w:r>
+        <w:rPr>
+          <w:lang w:val="vi-VN"/>
+        </w:rPr>
+        <w:t>2. Bệnh lùn xoắn lá</w:t>
+      </w:r>
+    </w:p>
+    <w:p>
+      <w:pPr>
+        <w:rPr>
+          <w:lang w:val="vi-VN"/>
+        </w:rPr>
+      </w:pPr>
+      <w:r>
+        <w:rPr>
+          <w:lang w:val="vi-VN"/>
+        </w:rPr>
+        <w:t>a. Tác nhân</w:t>
+      </w:r>
+    </w:p>
+    <w:p>
+      <w:pPr>
+        <w:rPr>
+          <w:lang w:val="vi-VN"/>
+        </w:rPr>
+      </w:pPr>
+      <w:r>
+        <w:rPr>
+          <w:lang w:val="vi-VN"/>
+        </w:rPr>
+        <w:t>Bệnh lùn xoắn lá do vi rút có tên RRSV</w:t>
+      </w:r>
+    </w:p>
+    <w:p>
+      <w:pPr>
+        <w:rPr>
+          <w:lang w:val="vi-VN"/>
+        </w:rPr>
+      </w:pPr>
+      <w:r>
+        <w:rPr>
+          <w:lang w:val="vi-VN"/>
+        </w:rPr>
+        <w:t>(Rice Ragged Stunt Virus) gây ra.</w:t>
+      </w:r>
+    </w:p>
+    <w:p>
+      <w:pPr>
+        <w:rPr>
+          <w:lang w:val="vi-VN"/>
+        </w:rPr>
+      </w:pPr>
+      <w:r>
+        <w:rPr>
+          <w:lang w:val="vi-VN"/>
+        </w:rPr>
+        <w:t>b. Nhận dạng</w:t>
+      </w:r>
+    </w:p>
+    <w:p>
+      <w:pPr>
+        <w:rPr>
+          <w:lang w:val="vi-VN"/>
+        </w:rPr>
+      </w:pPr>
+      <w:r>
+        <w:rPr>
+          <w:lang w:val="vi-VN"/>
+        </w:rPr>
+        <w:t>Triệu chứng bệnh trên cây lúa biểu hiện như sau:</w:t>
+      </w:r>
+    </w:p>
+    <w:p>
+      <w:pPr>
+        <w:rPr>
+          <w:lang w:val="vi-VN"/>
+        </w:rPr>
+      </w:pPr>
+      <w:r>
+        <w:rPr>
+          <w:lang w:val="vi-VN"/>
+        </w:rPr>
+        <w:t>- Cây bị lùn, màu lá xanh đậm</w:t>
+      </w:r>
+      <w:r>
+        <w:rPr>
+          <w:lang w:val="vi-VN"/>
+        </w:rPr>
+        <w:t>;</w:t>
+      </w:r>
+    </w:p>
+    <w:p>
+      <w:pPr>
+        <w:rPr>
+          <w:lang w:val="vi-VN"/>
+        </w:rPr>
+      </w:pPr>
+      <w:r>
+        <w:rPr>
+          <w:lang w:val="vi-VN"/>
+        </w:rPr>
+        <w:t>- Rìa lá bị rách và gợn sóng, dọc theo gân lá</w:t>
+      </w:r>
+    </w:p>
+    <w:p>
+      <w:pPr>
+        <w:rPr>
+          <w:lang w:val="vi-VN"/>
+        </w:rPr>
+      </w:pPr>
+      <w:r>
+        <w:rPr>
+          <w:lang w:val="vi-VN"/>
+        </w:rPr>
+        <w:t>có bướu;</w:t>
+      </w:r>
+    </w:p>
+    <w:p>
+      <w:pPr>
+        <w:rPr>
+          <w:lang w:val="vi-VN"/>
+        </w:rPr>
+      </w:pPr>
+      <w:r>
+        <w:rPr>
+          <w:lang w:val="vi-VN"/>
+        </w:rPr>
+        <w:t>- Chóp lá bị biến dạng, xoăn tít lại.</w:t>
+      </w:r>
+    </w:p>
+    <w:p>
+      <w:pPr>
+        <w:rPr>
+          <w:lang w:val="vi-VN"/>
+        </w:rPr>
+      </w:pPr>
+      <w:r>
+        <w:rPr>
+          <w:lang w:val="vi-VN"/>
+        </w:rPr>
+        <w:t>- Lúa không trổ được, bị nghẹn đòng, hạt lép.</w:t>
+      </w:r>
+    </w:p>
+    <w:p>
+      <w:pPr>
+        <w:rPr>
+          <w:lang w:val="vi-VN"/>
+        </w:rPr>
+      </w:pPr>
+      <w:r>
+        <w:rPr>
+          <w:lang w:val="vi-VN"/>
+        </w:rPr>
+        <w:t>c. Cách lan truyền bệnh</w:t>
+      </w:r>
+    </w:p>
+    <w:p>
+      <w:pPr>
+        <w:rPr>
+          <w:lang w:val="vi-VN"/>
+        </w:rPr>
+      </w:pPr>
+      <w:r>
+        <w:rPr>
+          <w:lang w:val="vi-VN"/>
+        </w:rPr>
+        <w:t>Cách lan truyền bệnh như bệnh vàng lùn</w:t>
+      </w:r>
+    </w:p>
+    <w:p>
+      <w:pPr>
+        <w:rPr>
+          <w:lang w:val="vi-VN"/>
+        </w:rPr>
+      </w:pPr>
+      <w:r>
+        <w:rPr>
+          <w:lang w:val="vi-VN"/>
+        </w:rPr>
+        <w:t>Lưu ý: có trường hợp trên một cây lúa đồng thời xuất hiện cả hai triệu chứng bệnh vàng lùn và lùn</w:t>
+      </w:r>
+    </w:p>
+    <w:p>
+      <w:pPr>
+        <w:rPr>
+          <w:lang w:val="vi-VN"/>
+        </w:rPr>
+      </w:pPr>
+      <w:r>
+        <w:rPr>
+          <w:lang w:val="vi-VN"/>
+        </w:rPr>
+        <w:t>xoắn lá</w:t>
+      </w:r>
+    </w:p>
+    <w:p>
+      <w:pPr>
+        <w:rPr>
+          <w:lang w:val="vi-VN"/>
+        </w:rPr>
+      </w:pPr>
+      <w:r>
+        <w:rPr>
+          <w:lang w:val="vi-VN"/>
+        </w:rPr>
+        <w:t>4. Phòng trừ bệnh vàng lùn và lùn xoắn lá</w:t>
+      </w:r>
+    </w:p>
+    <w:p>
+      <w:pPr>
+        <w:rPr>
+          <w:lang w:val="vi-VN"/>
+        </w:rPr>
+      </w:pPr>
+      <w:r>
+        <w:rPr>
+          <w:lang w:val="vi-VN"/>
+        </w:rPr>
+        <w:t>a. Phòng bệnh</w:t>
+      </w:r>
+    </w:p>
+    <w:p>
+      <w:pPr>
+        <w:rPr>
+          <w:lang w:val="vi-VN"/>
+        </w:rPr>
+      </w:pPr>
+      <w:r>
+        <w:rPr>
+          <w:lang w:val="vi-VN"/>
+        </w:rPr>
+        <w:t>Bệnh vàng lùn và lùn xoắn lá (cũng như bệnh lúa cỏ) gây hại cây lúa cho đến nay là chưa có thuốc</w:t>
+      </w:r>
+    </w:p>
+    <w:p>
+      <w:pPr>
+        <w:rPr>
+          <w:lang w:val="vi-VN"/>
+        </w:rPr>
+      </w:pPr>
+      <w:r>
+        <w:rPr>
+          <w:lang w:val="vi-VN"/>
+        </w:rPr>
+        <w:t>đặc trị; vì vậy biện pháp đầu tiên là phòng bệnh, bao gồm:</w:t>
+      </w:r>
+    </w:p>
+    <w:p>
+      <w:pPr>
+        <w:rPr>
+          <w:lang w:val="vi-VN"/>
+        </w:rPr>
+      </w:pPr>
+      <w:r>
+        <w:rPr>
+          <w:lang w:val="vi-VN"/>
+        </w:rPr>
+        <w:t>- Thực hiện triệt để các biện pháp phòng trừ rầy nâu như đã nêu ở phần trên,</w:t>
+      </w:r>
+    </w:p>
+    <w:p>
+      <w:pPr>
+        <w:rPr>
+          <w:lang w:val="vi-VN"/>
+        </w:rPr>
+      </w:pPr>
+      <w:r>
+        <w:rPr>
+          <w:lang w:val="vi-VN"/>
+        </w:rPr>
+        <w:lastRenderedPageBreak/>
+        <w:t>- Áp dụng các biện pháp canh tác đồng bộ để tạo cây lúa khỏe nhất là giai đoạn trước trổ để gia</w:t>
+      </w:r>
+    </w:p>
+    <w:p>
+      <w:pPr>
+        <w:rPr>
+          <w:lang w:val="vi-VN"/>
+        </w:rPr>
+      </w:pPr>
+      <w:r>
+        <w:rPr>
+          <w:lang w:val="vi-VN"/>
+        </w:rPr>
+        <w:t>tăng sức đề kháng của cây.</w:t>
+      </w:r>
+    </w:p>
+    <w:p>
+      <w:pPr>
+        <w:rPr>
+          <w:lang w:val="vi-VN"/>
+        </w:rPr>
+      </w:pPr>
+      <w:r>
+        <w:rPr>
+          <w:lang w:val="vi-VN"/>
+        </w:rPr>
+        <w:t>b. Tiêu hủy nguồn bệnh trên đồng ruộng, cụ thể như sau:</w:t>
+      </w:r>
+    </w:p>
+    <w:p>
+      <w:pPr>
+        <w:rPr>
+          <w:lang w:val="vi-VN"/>
+        </w:rPr>
+      </w:pPr>
+      <w:r>
+        <w:rPr>
+          <w:lang w:val="vi-VN"/>
+        </w:rPr>
+        <w:t>- Giai đọan lúa còn non (0 - 40 ngày sau gieo sạ): nếu ruộng lúa bị nhiễm bệnh nặng (trên 10% số</w:t>
+      </w:r>
+    </w:p>
+    <w:p>
+      <w:pPr>
+        <w:rPr>
+          <w:lang w:val="vi-VN"/>
+        </w:rPr>
+      </w:pPr>
+      <w:r>
+        <w:rPr>
+          <w:lang w:val="vi-VN"/>
+        </w:rPr>
+        <w:t>khóm bị bệnh) thì phải tiêu hủy ngay bằng cách cày, trục cả ruộng để diệt mầm bệnh; trước khi cày vùi phải</w:t>
+      </w:r>
+    </w:p>
+    <w:p>
+      <w:pPr>
+        <w:rPr>
+          <w:lang w:val="vi-VN"/>
+        </w:rPr>
+      </w:pPr>
+      <w:r>
+        <w:rPr>
+          <w:lang w:val="vi-VN"/>
+        </w:rPr>
+        <w:t>phun thuốc trừ rầy nâu để tránh phát tán truyền bệnh sang ruộng khác; nếu bị nhiễm nhẹ (rải rác, dưới</w:t>
+      </w:r>
+    </w:p>
+    <w:p>
+      <w:pPr>
+        <w:rPr>
+          <w:lang w:val="vi-VN"/>
+        </w:rPr>
+      </w:pPr>
+      <w:r>
+        <w:rPr>
+          <w:lang w:val="vi-VN"/>
+        </w:rPr>
+        <w:t>10% số khóm bị bệnh) thì phải nhổ bỏ cây bệnh và vùi xuống ruộng, không bỏ tràn lan trên bờ.</w:t>
+      </w:r>
+    </w:p>
+    <w:p>
+      <w:pPr>
+        <w:rPr>
+          <w:lang w:val="vi-VN"/>
+        </w:rPr>
+      </w:pPr>
+      <w:r>
+        <w:rPr>
+          <w:lang w:val="vi-VN"/>
+        </w:rPr>
+        <w:t>- Giai đoạn lúa sau gieo sạ 40 ngày trở đi: thường xuyên thăm đồng và nhổ, vùi bỏ bụi lúa bệnh; đồng</w:t>
+      </w:r>
+    </w:p>
+    <w:p>
+      <w:pPr>
+        <w:rPr>
+          <w:lang w:val="vi-VN"/>
+        </w:rPr>
+      </w:pPr>
+      <w:r>
+        <w:rPr>
+          <w:lang w:val="vi-VN"/>
+        </w:rPr>
+        <w:t>thời nếu phát hiện rầy cám có mật số trên 3 con/dảnh (tép) thì phải phun thuốc trừ rầy nâu theo hướng dẫn</w:t>
+      </w:r>
+    </w:p>
+    <w:p>
+      <w:pPr>
+        <w:rPr>
+          <w:lang w:val="vi-VN"/>
+        </w:rPr>
+      </w:pPr>
+      <w:r>
+        <w:rPr>
+          <w:lang w:val="vi-VN"/>
+        </w:rPr>
+        <w:t>ở phần trên. Nếu ruộng lúa bị nhiễm bệnh quá nặng thì tiêu hủy bằng cách cày, trụ c cả ruộng; trước khi</w:t>
+      </w:r>
+    </w:p>
+    <w:p>
+      <w:pPr>
+        <w:rPr>
+          <w:lang w:val="vi-VN"/>
+        </w:rPr>
+      </w:pPr>
+      <w:r>
+        <w:rPr>
+          <w:lang w:val="vi-VN"/>
+        </w:rPr>
+        <w:t>cày, trục phải phun thuốc trừ rầy nâu nếu có rầy trên lúa để tránh phát tán truyền bệnh sang ruộng khác.</w:t>
+      </w:r>
+    </w:p>
+    <w:p>
+      <w:pPr>
+        <w:rPr>
+          <w:lang w:val="vi-VN"/>
+        </w:rPr>
+      </w:pPr>
+      <w:r>
+        <w:rPr>
+          <w:lang w:val="vi-VN"/>
+        </w:rPr>
+        <w:t>5. Phân biệt bệnh vàng lùn với các triệu chứng vàng lá khác trên lúa</w:t>
+      </w:r>
+    </w:p>
+    <w:p>
+      <w:pPr>
+        <w:rPr>
+          <w:lang w:val="vi-VN"/>
+        </w:rPr>
+      </w:pPr>
+      <w:r>
+        <w:rPr>
+          <w:lang w:val="vi-VN"/>
+        </w:rPr>
+        <w:t>Trên đồng ruộng cũng thường xuất hiện một dạng bệnh khác có triệu chứng gần giống với triệu</w:t>
+      </w:r>
+    </w:p>
+    <w:p>
+      <w:pPr>
+        <w:rPr>
+          <w:lang w:val="vi-VN"/>
+        </w:rPr>
+      </w:pPr>
+      <w:r>
+        <w:rPr>
+          <w:lang w:val="vi-VN"/>
+        </w:rPr>
+        <w:t>chứng bệnh vàng lùn đó là triệu chứng do lúa bị bệnh ngộ độc hữu cơ.</w:t>
+      </w:r>
+    </w:p>
+    <w:p>
+      <w:pPr>
+        <w:rPr>
+          <w:lang w:val="vi-VN"/>
+        </w:rPr>
+      </w:pPr>
+      <w:r>
+        <w:rPr>
+          <w:lang w:val="vi-VN"/>
+        </w:rPr>
+        <w:t>Triệu chứng đặc trưng củ a bệnh do ngộ độc hữu cơ là khi nhổ cây lúa lên thì thấy đất có màu rất</w:t>
+      </w:r>
+      <w:r>
+        <w:rPr>
+          <w:lang w:val="vi-VN"/>
+        </w:rPr>
+        <w:t xml:space="preserve"> đ</w:t>
+      </w:r>
+      <w:r>
+        <w:rPr>
+          <w:lang w:val="vi-VN"/>
+        </w:rPr>
+        <w:t>en</w:t>
+      </w:r>
+      <w:r>
+        <w:rPr>
+          <w:lang w:val="vi-VN"/>
+        </w:rPr>
+        <w:t xml:space="preserve"> </w:t>
+      </w:r>
+      <w:r>
+        <w:rPr>
+          <w:lang w:val="vi-VN"/>
+        </w:rPr>
+        <w:t>và bộ rễ bị thối đen. Do rễ không hút được dưỡng chất nên bộ lá ngả sang màu</w:t>
+      </w:r>
+    </w:p>
+    <w:p>
+      <w:pPr>
+        <w:rPr>
+          <w:lang w:val="vi-VN"/>
+        </w:rPr>
+      </w:pPr>
+      <w:r>
+        <w:rPr>
+          <w:lang w:val="vi-VN"/>
+        </w:rPr>
+        <w:t>vàng, từ chóp lá xuống và từ mép lá vào.</w:t>
+      </w:r>
+    </w:p>
+    <w:p>
+      <w:pPr>
+        <w:rPr>
+          <w:lang w:val="vi-VN"/>
+        </w:rPr>
+      </w:pPr>
+      <w:r>
+        <w:rPr>
+          <w:lang w:val="vi-VN"/>
+        </w:rPr>
+        <w:t>Cách phân biệt giữa bệnh vàng lùn với ngộ độc hữu cơ là dựa vào màu sắc rễ lúa. Cây lúa bệnh</w:t>
+      </w:r>
+    </w:p>
+    <w:p>
+      <w:pPr>
+        <w:rPr>
+          <w:lang w:val="vi-VN"/>
+        </w:rPr>
+      </w:pPr>
+      <w:r>
+        <w:rPr>
+          <w:lang w:val="vi-VN"/>
+        </w:rPr>
+        <w:t>vàng lùn còn tươi có rễ màu trắng, còn lúa ngộ độc hữu cơ rễ có màu đen, mùi thối.</w:t>
+      </w:r>
+    </w:p>
+    <w:p>
+      <w:pPr>
+        <w:rPr>
+          <w:lang w:val="vi-VN"/>
+        </w:rPr>
+      </w:pPr>
+      <w:r>
+        <w:rPr>
+          <w:lang w:val="vi-VN"/>
+        </w:rPr>
+        <w:lastRenderedPageBreak/>
+        <w:t>Ruộng lúa thường bị ngộ độc hữu cơ khi: ruộng trũng, bị ngập nước liên tụ c; khoảng thời gian làm</w:t>
+      </w:r>
+    </w:p>
+    <w:p>
+      <w:pPr>
+        <w:rPr>
+          <w:lang w:val="vi-VN"/>
+        </w:rPr>
+      </w:pPr>
+      <w:r>
+        <w:rPr>
+          <w:lang w:val="vi-VN"/>
+        </w:rPr>
+        <w:t>đất đến khi gieo sạ rất ngắn (chưa đến 15-20 ngày); hoặc làm đất sơ sài, cày vùi rơm rạ rồi gieo sạ liền;</w:t>
+      </w:r>
+    </w:p>
+    <w:p>
+      <w:pPr>
+        <w:rPr>
+          <w:lang w:val="vi-VN"/>
+        </w:rPr>
+      </w:pPr>
+      <w:r>
+        <w:rPr>
+          <w:lang w:val="vi-VN"/>
+        </w:rPr>
+        <w:t>ruộng lúa gần các ao cá hay chuồng trại chăn nuôi bị tháo nước xuống ruộng thường xuyên.</w:t>
+      </w:r>
+    </w:p>
+    <w:p>
+      <w:pPr>
+        <w:rPr>
+          <w:lang w:val="vi-VN"/>
+        </w:rPr>
+      </w:pPr>
+      <w:r>
+        <w:rPr>
+          <w:lang w:val="vi-VN"/>
+        </w:rPr>
+        <w:t>Đây là dạng bệnh sinh lý cây lúa vì vậy cần áp dụng biện pháp xử lý như sau:</w:t>
+      </w:r>
+    </w:p>
+    <w:p>
+      <w:pPr>
+        <w:rPr>
+          <w:lang w:val="vi-VN"/>
+        </w:rPr>
+      </w:pPr>
+      <w:r>
+        <w:rPr>
+          <w:lang w:val="vi-VN"/>
+        </w:rPr>
+        <w:t>- Thay nước ruộng bằng cách rút nước ra, bơm nước mới vào từ 1-2 lần, phơi mặt ruộng.</w:t>
+      </w:r>
+    </w:p>
+    <w:p>
+      <w:pPr>
+        <w:rPr>
+          <w:lang w:val="vi-VN"/>
+        </w:rPr>
+      </w:pPr>
+      <w:r>
+        <w:rPr>
+          <w:lang w:val="vi-VN"/>
+        </w:rPr>
+        <w:t>- Ngưng bón phân đạm</w:t>
       </w:r>
     </w:p>
     <w:sectPr>

</xml_diff>

<commit_message>
Update re-chunkinng and cache
</commit_message>
<xml_diff>
--- a/backend_mdb/app/documents/disease_lua.docx
+++ b/backend_mdb/app/documents/disease_lua.docx
@@ -3184,11 +3184,6 @@
       </w:r>
     </w:p>
     <w:p>
-      <w:pPr>
-        <w:rPr>
-          <w:lang w:val="vi-VN"/>
-        </w:rPr>
-      </w:pPr>
       <w:r>
         <w:rPr>
           <w:lang w:val="vi-VN"/>
@@ -3196,6 +3191,7 @@
         <w:t>- Ngưng bón phân đạm</w:t>
       </w:r>
     </w:p>
+    <w:p/>
     <w:sectPr>
       <w:pgSz w:w="12240" w:h="15840"/>
       <w:pgMar w:top="1440" w:right="1440" w:bottom="1440" w:left="1440" w:header="720" w:footer="720" w:gutter="0"/>

</xml_diff>